<commit_message>
Update the D3 idea .docx to match the simulation-verified IDEA.md
Apply the same corrections as IDEA.md: TH2 repair D1 first (effective
output 660 vs 792, overtime ~3h vs ~1h45), TH3 tomorrow does not fit one
shift (990 > 960), TH4 rush order of 260 L-A, TH6 overtime ~57' (48' with
speed-up) and 48 L-A rush order, TH7 Yellow, plus sections 4.7, 9.1, 10
and the summary table. Edited in place to keep the formatting; the table
of contents page numbers are shifted to match the longer TH2 section.

Co-Authored-By: Claude Opus 5.5 <noreply@anthropic.com>
Claude-Session: https://claude.ai/code/session_015cxxftYpAzKzUnn6q7ikko
</commit_message>
<xml_diff>
--- a/D3_Y_tuong_va_giai_phap.docx
+++ b/D3_Y_tuong_va_giai_phap.docx
@@ -306,11 +306,7 @@
           </w:pPr>
           <w:r>
             <w:fldChar w:fldCharType="begin"/>
-          </w:r>
-          <w:r>
             <w:instrText xml:space="preserve">TOC \h \o "1-2"</w:instrText>
-          </w:r>
-          <w:r>
             <w:fldChar w:fldCharType="separate"/>
           </w:r>
         </w:p>
@@ -323,11 +319,7 @@
           </w:pPr>
           <w:r>
             <w:fldChar w:fldCharType="begin"/>
-          </w:r>
-          <w:r>
             <w:instrText xml:space="preserve"> HYPERLINK \l _Toc3351 </w:instrText>
-          </w:r>
-          <w:r>
             <w:fldChar w:fldCharType="separate"/>
           </w:r>
           <w:r>
@@ -338,23 +330,11 @@
           </w:r>
           <w:r>
             <w:tab/>
-          </w:r>
-          <w:r>
             <w:fldChar w:fldCharType="begin"/>
-          </w:r>
-          <w:r>
             <w:instrText xml:space="preserve"> PAGEREF _Toc3351 \h </w:instrText>
-          </w:r>
-          <w:r>
             <w:fldChar w:fldCharType="separate"/>
-          </w:r>
-          <w:r>
             <w:t>2</w:t>
-          </w:r>
-          <w:r>
             <w:fldChar w:fldCharType="end"/>
-          </w:r>
-          <w:r>
             <w:fldChar w:fldCharType="end"/>
           </w:r>
         </w:p>
@@ -367,11 +347,7 @@
           </w:pPr>
           <w:r>
             <w:fldChar w:fldCharType="begin"/>
-          </w:r>
-          <w:r>
             <w:instrText xml:space="preserve"> HYPERLINK \l _Toc27998 </w:instrText>
-          </w:r>
-          <w:r>
             <w:fldChar w:fldCharType="separate"/>
           </w:r>
           <w:r>
@@ -382,23 +358,11 @@
           </w:r>
           <w:r>
             <w:tab/>
-          </w:r>
-          <w:r>
             <w:fldChar w:fldCharType="begin"/>
-          </w:r>
-          <w:r>
             <w:instrText xml:space="preserve"> PAGEREF _Toc27998 \h </w:instrText>
-          </w:r>
-          <w:r>
             <w:fldChar w:fldCharType="separate"/>
-          </w:r>
-          <w:r>
             <w:t>2</w:t>
-          </w:r>
-          <w:r>
             <w:fldChar w:fldCharType="end"/>
-          </w:r>
-          <w:r>
             <w:fldChar w:fldCharType="end"/>
           </w:r>
         </w:p>
@@ -411,11 +375,7 @@
           </w:pPr>
           <w:r>
             <w:fldChar w:fldCharType="begin"/>
-          </w:r>
-          <w:r>
             <w:instrText xml:space="preserve"> HYPERLINK \l _Toc27120 </w:instrText>
-          </w:r>
-          <w:r>
             <w:fldChar w:fldCharType="separate"/>
           </w:r>
           <w:r>
@@ -426,23 +386,11 @@
           </w:r>
           <w:r>
             <w:tab/>
-          </w:r>
-          <w:r>
             <w:fldChar w:fldCharType="begin"/>
-          </w:r>
-          <w:r>
             <w:instrText xml:space="preserve"> PAGEREF _Toc27120 \h </w:instrText>
-          </w:r>
-          <w:r>
             <w:fldChar w:fldCharType="separate"/>
-          </w:r>
-          <w:r>
             <w:t>2</w:t>
-          </w:r>
-          <w:r>
             <w:fldChar w:fldCharType="end"/>
-          </w:r>
-          <w:r>
             <w:fldChar w:fldCharType="end"/>
           </w:r>
         </w:p>
@@ -455,11 +403,7 @@
           </w:pPr>
           <w:r>
             <w:fldChar w:fldCharType="begin"/>
-          </w:r>
-          <w:r>
             <w:instrText xml:space="preserve"> HYPERLINK \l _Toc631 </w:instrText>
-          </w:r>
-          <w:r>
             <w:fldChar w:fldCharType="separate"/>
           </w:r>
           <w:r>
@@ -470,23 +414,11 @@
           </w:r>
           <w:r>
             <w:tab/>
-          </w:r>
-          <w:r>
             <w:fldChar w:fldCharType="begin"/>
-          </w:r>
-          <w:r>
             <w:instrText xml:space="preserve"> PAGEREF _Toc631 \h </w:instrText>
-          </w:r>
-          <w:r>
             <w:fldChar w:fldCharType="separate"/>
-          </w:r>
-          <w:r>
             <w:t>3</w:t>
-          </w:r>
-          <w:r>
             <w:fldChar w:fldCharType="end"/>
-          </w:r>
-          <w:r>
             <w:fldChar w:fldCharType="end"/>
           </w:r>
         </w:p>
@@ -499,11 +431,7 @@
           </w:pPr>
           <w:r>
             <w:fldChar w:fldCharType="begin"/>
-          </w:r>
-          <w:r>
             <w:instrText xml:space="preserve"> HYPERLINK \l _Toc6881 </w:instrText>
-          </w:r>
-          <w:r>
             <w:fldChar w:fldCharType="separate"/>
           </w:r>
           <w:r>
@@ -514,23 +442,11 @@
           </w:r>
           <w:r>
             <w:tab/>
-          </w:r>
-          <w:r>
             <w:fldChar w:fldCharType="begin"/>
-          </w:r>
-          <w:r>
             <w:instrText xml:space="preserve"> PAGEREF _Toc6881 \h </w:instrText>
-          </w:r>
-          <w:r>
             <w:fldChar w:fldCharType="separate"/>
-          </w:r>
-          <w:r>
             <w:t>3</w:t>
-          </w:r>
-          <w:r>
             <w:fldChar w:fldCharType="end"/>
-          </w:r>
-          <w:r>
             <w:fldChar w:fldCharType="end"/>
           </w:r>
         </w:p>
@@ -543,11 +459,7 @@
           </w:pPr>
           <w:r>
             <w:fldChar w:fldCharType="begin"/>
-          </w:r>
-          <w:r>
             <w:instrText xml:space="preserve"> HYPERLINK \l _Toc17817 </w:instrText>
-          </w:r>
-          <w:r>
             <w:fldChar w:fldCharType="separate"/>
           </w:r>
           <w:r>
@@ -558,23 +470,11 @@
           </w:r>
           <w:r>
             <w:tab/>
-          </w:r>
-          <w:r>
             <w:fldChar w:fldCharType="begin"/>
-          </w:r>
-          <w:r>
             <w:instrText xml:space="preserve"> PAGEREF _Toc17817 \h </w:instrText>
-          </w:r>
-          <w:r>
             <w:fldChar w:fldCharType="separate"/>
-          </w:r>
-          <w:r>
             <w:t>3</w:t>
-          </w:r>
-          <w:r>
             <w:fldChar w:fldCharType="end"/>
-          </w:r>
-          <w:r>
             <w:fldChar w:fldCharType="end"/>
           </w:r>
         </w:p>
@@ -587,11 +487,7 @@
           </w:pPr>
           <w:r>
             <w:fldChar w:fldCharType="begin"/>
-          </w:r>
-          <w:r>
             <w:instrText xml:space="preserve"> HYPERLINK \l _Toc23483 </w:instrText>
-          </w:r>
-          <w:r>
             <w:fldChar w:fldCharType="separate"/>
           </w:r>
           <w:r>
@@ -602,23 +498,11 @@
           </w:r>
           <w:r>
             <w:tab/>
-          </w:r>
-          <w:r>
             <w:fldChar w:fldCharType="begin"/>
-          </w:r>
-          <w:r>
             <w:instrText xml:space="preserve"> PAGEREF _Toc23483 \h </w:instrText>
-          </w:r>
-          <w:r>
             <w:fldChar w:fldCharType="separate"/>
-          </w:r>
-          <w:r>
             <w:t>3</w:t>
-          </w:r>
-          <w:r>
             <w:fldChar w:fldCharType="end"/>
-          </w:r>
-          <w:r>
             <w:fldChar w:fldCharType="end"/>
           </w:r>
         </w:p>
@@ -631,11 +515,7 @@
           </w:pPr>
           <w:r>
             <w:fldChar w:fldCharType="begin"/>
-          </w:r>
-          <w:r>
             <w:instrText xml:space="preserve"> HYPERLINK \l _Toc16354 </w:instrText>
-          </w:r>
-          <w:r>
             <w:fldChar w:fldCharType="separate"/>
           </w:r>
           <w:r>
@@ -646,23 +526,11 @@
           </w:r>
           <w:r>
             <w:tab/>
-          </w:r>
-          <w:r>
             <w:fldChar w:fldCharType="begin"/>
-          </w:r>
-          <w:r>
             <w:instrText xml:space="preserve"> PAGEREF _Toc16354 \h </w:instrText>
-          </w:r>
-          <w:r>
             <w:fldChar w:fldCharType="separate"/>
-          </w:r>
-          <w:r>
             <w:t>3</w:t>
-          </w:r>
-          <w:r>
             <w:fldChar w:fldCharType="end"/>
-          </w:r>
-          <w:r>
             <w:fldChar w:fldCharType="end"/>
           </w:r>
         </w:p>
@@ -675,11 +543,7 @@
           </w:pPr>
           <w:r>
             <w:fldChar w:fldCharType="begin"/>
-          </w:r>
-          <w:r>
             <w:instrText xml:space="preserve"> HYPERLINK \l _Toc9078 </w:instrText>
-          </w:r>
-          <w:r>
             <w:fldChar w:fldCharType="separate"/>
           </w:r>
           <w:r>
@@ -690,23 +554,11 @@
           </w:r>
           <w:r>
             <w:tab/>
-          </w:r>
-          <w:r>
             <w:fldChar w:fldCharType="begin"/>
-          </w:r>
-          <w:r>
             <w:instrText xml:space="preserve"> PAGEREF _Toc9078 \h </w:instrText>
-          </w:r>
-          <w:r>
             <w:fldChar w:fldCharType="separate"/>
-          </w:r>
-          <w:r>
             <w:t>4</w:t>
-          </w:r>
-          <w:r>
             <w:fldChar w:fldCharType="end"/>
-          </w:r>
-          <w:r>
             <w:fldChar w:fldCharType="end"/>
           </w:r>
         </w:p>
@@ -719,11 +571,7 @@
           </w:pPr>
           <w:r>
             <w:fldChar w:fldCharType="begin"/>
-          </w:r>
-          <w:r>
             <w:instrText xml:space="preserve"> HYPERLINK \l _Toc32146 </w:instrText>
-          </w:r>
-          <w:r>
             <w:fldChar w:fldCharType="separate"/>
           </w:r>
           <w:r>
@@ -734,23 +582,11 @@
           </w:r>
           <w:r>
             <w:tab/>
-          </w:r>
-          <w:r>
             <w:fldChar w:fldCharType="begin"/>
-          </w:r>
-          <w:r>
             <w:instrText xml:space="preserve"> PAGEREF _Toc32146 \h </w:instrText>
-          </w:r>
-          <w:r>
             <w:fldChar w:fldCharType="separate"/>
-          </w:r>
-          <w:r>
             <w:t>4</w:t>
-          </w:r>
-          <w:r>
             <w:fldChar w:fldCharType="end"/>
-          </w:r>
-          <w:r>
             <w:fldChar w:fldCharType="end"/>
           </w:r>
         </w:p>
@@ -763,11 +599,7 @@
           </w:pPr>
           <w:r>
             <w:fldChar w:fldCharType="begin"/>
-          </w:r>
-          <w:r>
             <w:instrText xml:space="preserve"> HYPERLINK \l _Toc489 </w:instrText>
-          </w:r>
-          <w:r>
             <w:fldChar w:fldCharType="separate"/>
           </w:r>
           <w:r>
@@ -778,23 +610,11 @@
           </w:r>
           <w:r>
             <w:tab/>
-          </w:r>
-          <w:r>
             <w:fldChar w:fldCharType="begin"/>
-          </w:r>
-          <w:r>
             <w:instrText xml:space="preserve"> PAGEREF _Toc489 \h </w:instrText>
-          </w:r>
-          <w:r>
             <w:fldChar w:fldCharType="separate"/>
-          </w:r>
-          <w:r>
             <w:t>4</w:t>
-          </w:r>
-          <w:r>
             <w:fldChar w:fldCharType="end"/>
-          </w:r>
-          <w:r>
             <w:fldChar w:fldCharType="end"/>
           </w:r>
         </w:p>
@@ -807,11 +627,7 @@
           </w:pPr>
           <w:r>
             <w:fldChar w:fldCharType="begin"/>
-          </w:r>
-          <w:r>
             <w:instrText xml:space="preserve"> HYPERLINK \l _Toc6480 </w:instrText>
-          </w:r>
-          <w:r>
             <w:fldChar w:fldCharType="separate"/>
           </w:r>
           <w:r>
@@ -822,23 +638,11 @@
           </w:r>
           <w:r>
             <w:tab/>
-          </w:r>
-          <w:r>
             <w:fldChar w:fldCharType="begin"/>
-          </w:r>
-          <w:r>
             <w:instrText xml:space="preserve"> PAGEREF _Toc6480 \h </w:instrText>
-          </w:r>
-          <w:r>
             <w:fldChar w:fldCharType="separate"/>
-          </w:r>
-          <w:r>
             <w:t>4</w:t>
-          </w:r>
-          <w:r>
             <w:fldChar w:fldCharType="end"/>
-          </w:r>
-          <w:r>
             <w:fldChar w:fldCharType="end"/>
           </w:r>
         </w:p>
@@ -851,11 +655,7 @@
           </w:pPr>
           <w:r>
             <w:fldChar w:fldCharType="begin"/>
-          </w:r>
-          <w:r>
             <w:instrText xml:space="preserve"> HYPERLINK \l _Toc4232 </w:instrText>
-          </w:r>
-          <w:r>
             <w:fldChar w:fldCharType="separate"/>
           </w:r>
           <w:r>
@@ -866,23 +666,11 @@
           </w:r>
           <w:r>
             <w:tab/>
-          </w:r>
-          <w:r>
             <w:fldChar w:fldCharType="begin"/>
-          </w:r>
-          <w:r>
             <w:instrText xml:space="preserve"> PAGEREF _Toc4232 \h </w:instrText>
-          </w:r>
-          <w:r>
             <w:fldChar w:fldCharType="separate"/>
-          </w:r>
-          <w:r>
             <w:t>4</w:t>
-          </w:r>
-          <w:r>
             <w:fldChar w:fldCharType="end"/>
-          </w:r>
-          <w:r>
             <w:fldChar w:fldCharType="end"/>
           </w:r>
         </w:p>
@@ -895,11 +683,7 @@
           </w:pPr>
           <w:r>
             <w:fldChar w:fldCharType="begin"/>
-          </w:r>
-          <w:r>
             <w:instrText xml:space="preserve"> HYPERLINK \l _Toc12931 </w:instrText>
-          </w:r>
-          <w:r>
             <w:fldChar w:fldCharType="separate"/>
           </w:r>
           <w:r>
@@ -910,23 +694,11 @@
           </w:r>
           <w:r>
             <w:tab/>
-          </w:r>
-          <w:r>
             <w:fldChar w:fldCharType="begin"/>
-          </w:r>
-          <w:r>
             <w:instrText xml:space="preserve"> PAGEREF _Toc12931 \h </w:instrText>
-          </w:r>
-          <w:r>
             <w:fldChar w:fldCharType="separate"/>
-          </w:r>
-          <w:r>
             <w:t>5</w:t>
-          </w:r>
-          <w:r>
             <w:fldChar w:fldCharType="end"/>
-          </w:r>
-          <w:r>
             <w:fldChar w:fldCharType="end"/>
           </w:r>
         </w:p>
@@ -939,11 +711,7 @@
           </w:pPr>
           <w:r>
             <w:fldChar w:fldCharType="begin"/>
-          </w:r>
-          <w:r>
             <w:instrText xml:space="preserve"> HYPERLINK \l _Toc13789 </w:instrText>
-          </w:r>
-          <w:r>
             <w:fldChar w:fldCharType="separate"/>
           </w:r>
           <w:r>
@@ -954,23 +722,11 @@
           </w:r>
           <w:r>
             <w:tab/>
-          </w:r>
-          <w:r>
             <w:fldChar w:fldCharType="begin"/>
-          </w:r>
-          <w:r>
             <w:instrText xml:space="preserve"> PAGEREF _Toc13789 \h </w:instrText>
-          </w:r>
-          <w:r>
             <w:fldChar w:fldCharType="separate"/>
-          </w:r>
-          <w:r>
             <w:t>5</w:t>
-          </w:r>
-          <w:r>
             <w:fldChar w:fldCharType="end"/>
-          </w:r>
-          <w:r>
             <w:fldChar w:fldCharType="end"/>
           </w:r>
         </w:p>
@@ -983,11 +739,7 @@
           </w:pPr>
           <w:r>
             <w:fldChar w:fldCharType="begin"/>
-          </w:r>
-          <w:r>
             <w:instrText xml:space="preserve"> HYPERLINK \l _Toc12130 </w:instrText>
-          </w:r>
-          <w:r>
             <w:fldChar w:fldCharType="separate"/>
           </w:r>
           <w:r>
@@ -998,23 +750,11 @@
           </w:r>
           <w:r>
             <w:tab/>
-          </w:r>
-          <w:r>
             <w:fldChar w:fldCharType="begin"/>
-          </w:r>
-          <w:r>
             <w:instrText xml:space="preserve"> PAGEREF _Toc12130 \h </w:instrText>
-          </w:r>
-          <w:r>
             <w:fldChar w:fldCharType="separate"/>
-          </w:r>
-          <w:r>
             <w:t>5</w:t>
-          </w:r>
-          <w:r>
             <w:fldChar w:fldCharType="end"/>
-          </w:r>
-          <w:r>
             <w:fldChar w:fldCharType="end"/>
           </w:r>
         </w:p>
@@ -1027,11 +767,7 @@
           </w:pPr>
           <w:r>
             <w:fldChar w:fldCharType="begin"/>
-          </w:r>
-          <w:r>
             <w:instrText xml:space="preserve"> HYPERLINK \l _Toc14790 </w:instrText>
-          </w:r>
-          <w:r>
             <w:fldChar w:fldCharType="separate"/>
           </w:r>
           <w:r>
@@ -1042,23 +778,11 @@
           </w:r>
           <w:r>
             <w:tab/>
-          </w:r>
-          <w:r>
             <w:fldChar w:fldCharType="begin"/>
-          </w:r>
-          <w:r>
             <w:instrText xml:space="preserve"> PAGEREF _Toc14790 \h </w:instrText>
-          </w:r>
-          <w:r>
             <w:fldChar w:fldCharType="separate"/>
-          </w:r>
-          <w:r>
             <w:t>5</w:t>
-          </w:r>
-          <w:r>
             <w:fldChar w:fldCharType="end"/>
-          </w:r>
-          <w:r>
             <w:fldChar w:fldCharType="end"/>
           </w:r>
         </w:p>
@@ -1071,11 +795,7 @@
           </w:pPr>
           <w:r>
             <w:fldChar w:fldCharType="begin"/>
-          </w:r>
-          <w:r>
             <w:instrText xml:space="preserve"> HYPERLINK \l _Toc28852 </w:instrText>
-          </w:r>
-          <w:r>
             <w:fldChar w:fldCharType="separate"/>
           </w:r>
           <w:r>
@@ -1086,23 +806,11 @@
           </w:r>
           <w:r>
             <w:tab/>
-          </w:r>
-          <w:r>
             <w:fldChar w:fldCharType="begin"/>
-          </w:r>
-          <w:r>
             <w:instrText xml:space="preserve"> PAGEREF _Toc28852 \h </w:instrText>
-          </w:r>
-          <w:r>
             <w:fldChar w:fldCharType="separate"/>
-          </w:r>
-          <w:r>
             <w:t>6</w:t>
-          </w:r>
-          <w:r>
             <w:fldChar w:fldCharType="end"/>
-          </w:r>
-          <w:r>
             <w:fldChar w:fldCharType="end"/>
           </w:r>
         </w:p>
@@ -1115,11 +823,7 @@
           </w:pPr>
           <w:r>
             <w:fldChar w:fldCharType="begin"/>
-          </w:r>
-          <w:r>
             <w:instrText xml:space="preserve"> HYPERLINK \l _Toc22730 </w:instrText>
-          </w:r>
-          <w:r>
             <w:fldChar w:fldCharType="separate"/>
           </w:r>
           <w:r>
@@ -1130,23 +834,11 @@
           </w:r>
           <w:r>
             <w:tab/>
-          </w:r>
-          <w:r>
             <w:fldChar w:fldCharType="begin"/>
-          </w:r>
-          <w:r>
             <w:instrText xml:space="preserve"> PAGEREF _Toc22730 \h </w:instrText>
-          </w:r>
-          <w:r>
             <w:fldChar w:fldCharType="separate"/>
-          </w:r>
-          <w:r>
             <w:t>6</w:t>
-          </w:r>
-          <w:r>
             <w:fldChar w:fldCharType="end"/>
-          </w:r>
-          <w:r>
             <w:fldChar w:fldCharType="end"/>
           </w:r>
         </w:p>
@@ -1159,11 +851,7 @@
           </w:pPr>
           <w:r>
             <w:fldChar w:fldCharType="begin"/>
-          </w:r>
-          <w:r>
             <w:instrText xml:space="preserve"> HYPERLINK \l _Toc3155 </w:instrText>
-          </w:r>
-          <w:r>
             <w:fldChar w:fldCharType="separate"/>
           </w:r>
           <w:r>
@@ -1174,23 +862,11 @@
           </w:r>
           <w:r>
             <w:tab/>
-          </w:r>
-          <w:r>
             <w:fldChar w:fldCharType="begin"/>
-          </w:r>
-          <w:r>
             <w:instrText xml:space="preserve"> PAGEREF _Toc3155 \h </w:instrText>
-          </w:r>
-          <w:r>
             <w:fldChar w:fldCharType="separate"/>
-          </w:r>
-          <w:r>
             <w:t>6</w:t>
-          </w:r>
-          <w:r>
             <w:fldChar w:fldCharType="end"/>
-          </w:r>
-          <w:r>
             <w:fldChar w:fldCharType="end"/>
           </w:r>
         </w:p>
@@ -1203,11 +879,7 @@
           </w:pPr>
           <w:r>
             <w:fldChar w:fldCharType="begin"/>
-          </w:r>
-          <w:r>
             <w:instrText xml:space="preserve"> HYPERLINK \l _Toc14088 </w:instrText>
-          </w:r>
-          <w:r>
             <w:fldChar w:fldCharType="separate"/>
           </w:r>
           <w:r>
@@ -1218,23 +890,11 @@
           </w:r>
           <w:r>
             <w:tab/>
-          </w:r>
-          <w:r>
             <w:fldChar w:fldCharType="begin"/>
-          </w:r>
-          <w:r>
             <w:instrText xml:space="preserve"> PAGEREF _Toc14088 \h </w:instrText>
-          </w:r>
-          <w:r>
             <w:fldChar w:fldCharType="separate"/>
-          </w:r>
-          <w:r>
             <w:t>7</w:t>
-          </w:r>
-          <w:r>
             <w:fldChar w:fldCharType="end"/>
-          </w:r>
-          <w:r>
             <w:fldChar w:fldCharType="end"/>
           </w:r>
         </w:p>
@@ -1247,11 +907,7 @@
           </w:pPr>
           <w:r>
             <w:fldChar w:fldCharType="begin"/>
-          </w:r>
-          <w:r>
             <w:instrText xml:space="preserve"> HYPERLINK \l _Toc3303 </w:instrText>
-          </w:r>
-          <w:r>
             <w:fldChar w:fldCharType="separate"/>
           </w:r>
           <w:r>
@@ -1262,23 +918,11 @@
           </w:r>
           <w:r>
             <w:tab/>
-          </w:r>
-          <w:r>
             <w:fldChar w:fldCharType="begin"/>
-          </w:r>
-          <w:r>
             <w:instrText xml:space="preserve"> PAGEREF _Toc3303 \h </w:instrText>
-          </w:r>
-          <w:r>
             <w:fldChar w:fldCharType="separate"/>
-          </w:r>
-          <w:r>
             <w:t>7</w:t>
-          </w:r>
-          <w:r>
             <w:fldChar w:fldCharType="end"/>
-          </w:r>
-          <w:r>
             <w:fldChar w:fldCharType="end"/>
           </w:r>
         </w:p>
@@ -1291,11 +935,7 @@
           </w:pPr>
           <w:r>
             <w:fldChar w:fldCharType="begin"/>
-          </w:r>
-          <w:r>
             <w:instrText xml:space="preserve"> HYPERLINK \l _Toc22401 </w:instrText>
-          </w:r>
-          <w:r>
             <w:fldChar w:fldCharType="separate"/>
           </w:r>
           <w:r>
@@ -1306,23 +946,11 @@
           </w:r>
           <w:r>
             <w:tab/>
-          </w:r>
-          <w:r>
             <w:fldChar w:fldCharType="begin"/>
-          </w:r>
-          <w:r>
             <w:instrText xml:space="preserve"> PAGEREF _Toc22401 \h </w:instrText>
-          </w:r>
-          <w:r>
             <w:fldChar w:fldCharType="separate"/>
-          </w:r>
-          <w:r>
             <w:t>7</w:t>
-          </w:r>
-          <w:r>
             <w:fldChar w:fldCharType="end"/>
-          </w:r>
-          <w:r>
             <w:fldChar w:fldCharType="end"/>
           </w:r>
         </w:p>
@@ -1335,11 +963,7 @@
           </w:pPr>
           <w:r>
             <w:fldChar w:fldCharType="begin"/>
-          </w:r>
-          <w:r>
             <w:instrText xml:space="preserve"> HYPERLINK \l _Toc26752 </w:instrText>
-          </w:r>
-          <w:r>
             <w:fldChar w:fldCharType="separate"/>
           </w:r>
           <w:r>
@@ -1350,23 +974,11 @@
           </w:r>
           <w:r>
             <w:tab/>
-          </w:r>
-          <w:r>
             <w:fldChar w:fldCharType="begin"/>
-          </w:r>
-          <w:r>
             <w:instrText xml:space="preserve"> PAGEREF _Toc26752 \h </w:instrText>
-          </w:r>
-          <w:r>
             <w:fldChar w:fldCharType="separate"/>
-          </w:r>
-          <w:r>
             <w:t>8</w:t>
-          </w:r>
-          <w:r>
             <w:fldChar w:fldCharType="end"/>
-          </w:r>
-          <w:r>
             <w:fldChar w:fldCharType="end"/>
           </w:r>
         </w:p>
@@ -1379,11 +991,7 @@
           </w:pPr>
           <w:r>
             <w:fldChar w:fldCharType="begin"/>
-          </w:r>
-          <w:r>
             <w:instrText xml:space="preserve"> HYPERLINK \l _Toc8909 </w:instrText>
-          </w:r>
-          <w:r>
             <w:fldChar w:fldCharType="separate"/>
           </w:r>
           <w:r>
@@ -1394,23 +1002,11 @@
           </w:r>
           <w:r>
             <w:tab/>
-          </w:r>
-          <w:r>
             <w:fldChar w:fldCharType="begin"/>
-          </w:r>
-          <w:r>
             <w:instrText xml:space="preserve"> PAGEREF _Toc8909 \h </w:instrText>
-          </w:r>
-          <w:r>
             <w:fldChar w:fldCharType="separate"/>
-          </w:r>
-          <w:r>
             <w:t>9</w:t>
-          </w:r>
-          <w:r>
             <w:fldChar w:fldCharType="end"/>
-          </w:r>
-          <w:r>
             <w:fldChar w:fldCharType="end"/>
           </w:r>
         </w:p>
@@ -1423,11 +1019,7 @@
           </w:pPr>
           <w:r>
             <w:fldChar w:fldCharType="begin"/>
-          </w:r>
-          <w:r>
             <w:instrText xml:space="preserve"> HYPERLINK \l _Toc11508 </w:instrText>
-          </w:r>
-          <w:r>
             <w:fldChar w:fldCharType="separate"/>
           </w:r>
           <w:r>
@@ -1438,23 +1030,11 @@
           </w:r>
           <w:r>
             <w:tab/>
-          </w:r>
-          <w:r>
             <w:fldChar w:fldCharType="begin"/>
-          </w:r>
-          <w:r>
             <w:instrText xml:space="preserve"> PAGEREF _Toc11508 \h </w:instrText>
-          </w:r>
-          <w:r>
             <w:fldChar w:fldCharType="separate"/>
-          </w:r>
-          <w:r>
-            <w:t>9</w:t>
-          </w:r>
-          <w:r>
+            <w:t>10</w:t>
             <w:fldChar w:fldCharType="end"/>
-          </w:r>
-          <w:r>
             <w:fldChar w:fldCharType="end"/>
           </w:r>
         </w:p>
@@ -1467,11 +1047,7 @@
           </w:pPr>
           <w:r>
             <w:fldChar w:fldCharType="begin"/>
-          </w:r>
-          <w:r>
             <w:instrText xml:space="preserve"> HYPERLINK \l _Toc8327 </w:instrText>
-          </w:r>
-          <w:r>
             <w:fldChar w:fldCharType="separate"/>
           </w:r>
           <w:r>
@@ -1482,23 +1058,11 @@
           </w:r>
           <w:r>
             <w:tab/>
-          </w:r>
-          <w:r>
             <w:fldChar w:fldCharType="begin"/>
-          </w:r>
-          <w:r>
             <w:instrText xml:space="preserve"> PAGEREF _Toc8327 \h </w:instrText>
-          </w:r>
-          <w:r>
             <w:fldChar w:fldCharType="separate"/>
-          </w:r>
-          <w:r>
             <w:t>10</w:t>
-          </w:r>
-          <w:r>
             <w:fldChar w:fldCharType="end"/>
-          </w:r>
-          <w:r>
             <w:fldChar w:fldCharType="end"/>
           </w:r>
         </w:p>
@@ -1511,11 +1075,7 @@
           </w:pPr>
           <w:r>
             <w:fldChar w:fldCharType="begin"/>
-          </w:r>
-          <w:r>
             <w:instrText xml:space="preserve"> HYPERLINK \l _Toc6184 </w:instrText>
-          </w:r>
-          <w:r>
             <w:fldChar w:fldCharType="separate"/>
           </w:r>
           <w:r>
@@ -1526,23 +1086,11 @@
           </w:r>
           <w:r>
             <w:tab/>
-          </w:r>
-          <w:r>
             <w:fldChar w:fldCharType="begin"/>
-          </w:r>
-          <w:r>
             <w:instrText xml:space="preserve"> PAGEREF _Toc6184 \h </w:instrText>
-          </w:r>
-          <w:r>
             <w:fldChar w:fldCharType="separate"/>
-          </w:r>
-          <w:r>
-            <w:t>10</w:t>
-          </w:r>
-          <w:r>
+            <w:t>11</w:t>
             <w:fldChar w:fldCharType="end"/>
-          </w:r>
-          <w:r>
             <w:fldChar w:fldCharType="end"/>
           </w:r>
         </w:p>
@@ -1555,11 +1103,7 @@
           </w:pPr>
           <w:r>
             <w:fldChar w:fldCharType="begin"/>
-          </w:r>
-          <w:r>
             <w:instrText xml:space="preserve"> HYPERLINK \l _Toc24808 </w:instrText>
-          </w:r>
-          <w:r>
             <w:fldChar w:fldCharType="separate"/>
           </w:r>
           <w:r>
@@ -1570,23 +1114,11 @@
           </w:r>
           <w:r>
             <w:tab/>
-          </w:r>
-          <w:r>
             <w:fldChar w:fldCharType="begin"/>
-          </w:r>
-          <w:r>
             <w:instrText xml:space="preserve"> PAGEREF _Toc24808 \h </w:instrText>
-          </w:r>
-          <w:r>
             <w:fldChar w:fldCharType="separate"/>
-          </w:r>
-          <w:r>
-            <w:t>10</w:t>
-          </w:r>
-          <w:r>
+            <w:t>11</w:t>
             <w:fldChar w:fldCharType="end"/>
-          </w:r>
-          <w:r>
             <w:fldChar w:fldCharType="end"/>
           </w:r>
         </w:p>
@@ -1599,11 +1131,7 @@
           </w:pPr>
           <w:r>
             <w:fldChar w:fldCharType="begin"/>
-          </w:r>
-          <w:r>
             <w:instrText xml:space="preserve"> HYPERLINK \l _Toc17329 </w:instrText>
-          </w:r>
-          <w:r>
             <w:fldChar w:fldCharType="separate"/>
           </w:r>
           <w:r>
@@ -1614,23 +1142,11 @@
           </w:r>
           <w:r>
             <w:tab/>
-          </w:r>
-          <w:r>
             <w:fldChar w:fldCharType="begin"/>
-          </w:r>
-          <w:r>
             <w:instrText xml:space="preserve"> PAGEREF _Toc17329 \h </w:instrText>
-          </w:r>
-          <w:r>
             <w:fldChar w:fldCharType="separate"/>
-          </w:r>
-          <w:r>
             <w:t>11</w:t>
-          </w:r>
-          <w:r>
             <w:fldChar w:fldCharType="end"/>
-          </w:r>
-          <w:r>
             <w:fldChar w:fldCharType="end"/>
           </w:r>
         </w:p>
@@ -1643,11 +1159,7 @@
           </w:pPr>
           <w:r>
             <w:fldChar w:fldCharType="begin"/>
-          </w:r>
-          <w:r>
             <w:instrText xml:space="preserve"> HYPERLINK \l _Toc16491 </w:instrText>
-          </w:r>
-          <w:r>
             <w:fldChar w:fldCharType="separate"/>
           </w:r>
           <w:r>
@@ -1658,23 +1170,11 @@
           </w:r>
           <w:r>
             <w:tab/>
-          </w:r>
-          <w:r>
             <w:fldChar w:fldCharType="begin"/>
-          </w:r>
-          <w:r>
             <w:instrText xml:space="preserve"> PAGEREF _Toc16491 \h </w:instrText>
-          </w:r>
-          <w:r>
             <w:fldChar w:fldCharType="separate"/>
-          </w:r>
-          <w:r>
             <w:t>11</w:t>
-          </w:r>
-          <w:r>
             <w:fldChar w:fldCharType="end"/>
-          </w:r>
-          <w:r>
             <w:fldChar w:fldCharType="end"/>
           </w:r>
         </w:p>
@@ -1687,11 +1187,7 @@
           </w:pPr>
           <w:r>
             <w:fldChar w:fldCharType="begin"/>
-          </w:r>
-          <w:r>
             <w:instrText xml:space="preserve"> HYPERLINK \l _Toc1648 </w:instrText>
-          </w:r>
-          <w:r>
             <w:fldChar w:fldCharType="separate"/>
           </w:r>
           <w:r>
@@ -1702,23 +1198,11 @@
           </w:r>
           <w:r>
             <w:tab/>
-          </w:r>
-          <w:r>
             <w:fldChar w:fldCharType="begin"/>
-          </w:r>
-          <w:r>
             <w:instrText xml:space="preserve"> PAGEREF _Toc1648 \h </w:instrText>
-          </w:r>
-          <w:r>
             <w:fldChar w:fldCharType="separate"/>
-          </w:r>
-          <w:r>
-            <w:t>11</w:t>
-          </w:r>
-          <w:r>
+            <w:t>12</w:t>
             <w:fldChar w:fldCharType="end"/>
-          </w:r>
-          <w:r>
             <w:fldChar w:fldCharType="end"/>
           </w:r>
         </w:p>
@@ -1731,11 +1215,7 @@
           </w:pPr>
           <w:r>
             <w:fldChar w:fldCharType="begin"/>
-          </w:r>
-          <w:r>
             <w:instrText xml:space="preserve"> HYPERLINK \l _Toc15734 </w:instrText>
-          </w:r>
-          <w:r>
             <w:fldChar w:fldCharType="separate"/>
           </w:r>
           <w:r>
@@ -1746,23 +1226,11 @@
           </w:r>
           <w:r>
             <w:tab/>
-          </w:r>
-          <w:r>
             <w:fldChar w:fldCharType="begin"/>
-          </w:r>
-          <w:r>
             <w:instrText xml:space="preserve"> PAGEREF _Toc15734 \h </w:instrText>
-          </w:r>
-          <w:r>
             <w:fldChar w:fldCharType="separate"/>
-          </w:r>
-          <w:r>
-            <w:t>11</w:t>
-          </w:r>
-          <w:r>
+            <w:t>12</w:t>
             <w:fldChar w:fldCharType="end"/>
-          </w:r>
-          <w:r>
             <w:fldChar w:fldCharType="end"/>
           </w:r>
         </w:p>
@@ -1775,11 +1243,7 @@
           </w:pPr>
           <w:r>
             <w:fldChar w:fldCharType="begin"/>
-          </w:r>
-          <w:r>
             <w:instrText xml:space="preserve"> HYPERLINK \l _Toc1044 </w:instrText>
-          </w:r>
-          <w:r>
             <w:fldChar w:fldCharType="separate"/>
           </w:r>
           <w:r>
@@ -1790,23 +1254,11 @@
           </w:r>
           <w:r>
             <w:tab/>
-          </w:r>
-          <w:r>
             <w:fldChar w:fldCharType="begin"/>
-          </w:r>
-          <w:r>
             <w:instrText xml:space="preserve"> PAGEREF _Toc1044 \h </w:instrText>
-          </w:r>
-          <w:r>
             <w:fldChar w:fldCharType="separate"/>
-          </w:r>
-          <w:r>
-            <w:t>11</w:t>
-          </w:r>
-          <w:r>
+            <w:t>12</w:t>
             <w:fldChar w:fldCharType="end"/>
-          </w:r>
-          <w:r>
             <w:fldChar w:fldCharType="end"/>
           </w:r>
         </w:p>
@@ -1819,11 +1271,7 @@
           </w:pPr>
           <w:r>
             <w:fldChar w:fldCharType="begin"/>
-          </w:r>
-          <w:r>
             <w:instrText xml:space="preserve"> HYPERLINK \l _Toc6230 </w:instrText>
-          </w:r>
-          <w:r>
             <w:fldChar w:fldCharType="separate"/>
           </w:r>
           <w:r>
@@ -1834,23 +1282,11 @@
           </w:r>
           <w:r>
             <w:tab/>
-          </w:r>
-          <w:r>
             <w:fldChar w:fldCharType="begin"/>
-          </w:r>
-          <w:r>
             <w:instrText xml:space="preserve"> PAGEREF _Toc6230 \h </w:instrText>
-          </w:r>
-          <w:r>
             <w:fldChar w:fldCharType="separate"/>
-          </w:r>
-          <w:r>
-            <w:t>11</w:t>
-          </w:r>
-          <w:r>
+            <w:t>12</w:t>
             <w:fldChar w:fldCharType="end"/>
-          </w:r>
-          <w:r>
             <w:fldChar w:fldCharType="end"/>
           </w:r>
         </w:p>
@@ -1863,11 +1299,7 @@
           </w:pPr>
           <w:r>
             <w:fldChar w:fldCharType="begin"/>
-          </w:r>
-          <w:r>
             <w:instrText xml:space="preserve"> HYPERLINK \l _Toc25002 </w:instrText>
-          </w:r>
-          <w:r>
             <w:fldChar w:fldCharType="separate"/>
           </w:r>
           <w:r>
@@ -1878,23 +1310,11 @@
           </w:r>
           <w:r>
             <w:tab/>
-          </w:r>
-          <w:r>
             <w:fldChar w:fldCharType="begin"/>
-          </w:r>
-          <w:r>
             <w:instrText xml:space="preserve"> PAGEREF _Toc25002 \h </w:instrText>
-          </w:r>
-          <w:r>
             <w:fldChar w:fldCharType="separate"/>
-          </w:r>
-          <w:r>
-            <w:t>11</w:t>
-          </w:r>
-          <w:r>
+            <w:t>12</w:t>
             <w:fldChar w:fldCharType="end"/>
-          </w:r>
-          <w:r>
             <w:fldChar w:fldCharType="end"/>
           </w:r>
         </w:p>
@@ -1907,11 +1327,7 @@
           </w:pPr>
           <w:r>
             <w:fldChar w:fldCharType="begin"/>
-          </w:r>
-          <w:r>
             <w:instrText xml:space="preserve"> HYPERLINK \l _Toc30739 </w:instrText>
-          </w:r>
-          <w:r>
             <w:fldChar w:fldCharType="separate"/>
           </w:r>
           <w:r>
@@ -1922,23 +1338,11 @@
           </w:r>
           <w:r>
             <w:tab/>
-          </w:r>
-          <w:r>
             <w:fldChar w:fldCharType="begin"/>
-          </w:r>
-          <w:r>
             <w:instrText xml:space="preserve"> PAGEREF _Toc30739 \h </w:instrText>
-          </w:r>
-          <w:r>
             <w:fldChar w:fldCharType="separate"/>
-          </w:r>
-          <w:r>
             <w:t>12</w:t>
-          </w:r>
-          <w:r>
             <w:fldChar w:fldCharType="end"/>
-          </w:r>
-          <w:r>
             <w:fldChar w:fldCharType="end"/>
           </w:r>
         </w:p>
@@ -1951,11 +1355,7 @@
           </w:pPr>
           <w:r>
             <w:fldChar w:fldCharType="begin"/>
-          </w:r>
-          <w:r>
             <w:instrText xml:space="preserve"> HYPERLINK \l _Toc3996 </w:instrText>
-          </w:r>
-          <w:r>
             <w:fldChar w:fldCharType="separate"/>
           </w:r>
           <w:r>
@@ -1966,23 +1366,11 @@
           </w:r>
           <w:r>
             <w:tab/>
-          </w:r>
-          <w:r>
             <w:fldChar w:fldCharType="begin"/>
-          </w:r>
-          <w:r>
             <w:instrText xml:space="preserve"> PAGEREF _Toc3996 \h </w:instrText>
-          </w:r>
-          <w:r>
             <w:fldChar w:fldCharType="separate"/>
-          </w:r>
-          <w:r>
             <w:t>12</w:t>
-          </w:r>
-          <w:r>
             <w:fldChar w:fldCharType="end"/>
-          </w:r>
-          <w:r>
             <w:fldChar w:fldCharType="end"/>
           </w:r>
         </w:p>
@@ -1995,11 +1383,7 @@
           </w:pPr>
           <w:r>
             <w:fldChar w:fldCharType="begin"/>
-          </w:r>
-          <w:r>
             <w:instrText xml:space="preserve"> HYPERLINK \l _Toc25316 </w:instrText>
-          </w:r>
-          <w:r>
             <w:fldChar w:fldCharType="separate"/>
           </w:r>
           <w:r>
@@ -2010,23 +1394,11 @@
           </w:r>
           <w:r>
             <w:tab/>
-          </w:r>
-          <w:r>
             <w:fldChar w:fldCharType="begin"/>
-          </w:r>
-          <w:r>
             <w:instrText xml:space="preserve"> PAGEREF _Toc25316 \h </w:instrText>
-          </w:r>
-          <w:r>
             <w:fldChar w:fldCharType="separate"/>
-          </w:r>
-          <w:r>
             <w:t>12</w:t>
-          </w:r>
-          <w:r>
             <w:fldChar w:fldCharType="end"/>
-          </w:r>
-          <w:r>
             <w:fldChar w:fldCharType="end"/>
           </w:r>
         </w:p>
@@ -2039,11 +1411,7 @@
           </w:pPr>
           <w:r>
             <w:fldChar w:fldCharType="begin"/>
-          </w:r>
-          <w:r>
             <w:instrText xml:space="preserve"> HYPERLINK \l _Toc23766 </w:instrText>
-          </w:r>
-          <w:r>
             <w:fldChar w:fldCharType="separate"/>
           </w:r>
           <w:r>
@@ -2054,23 +1422,11 @@
           </w:r>
           <w:r>
             <w:tab/>
-          </w:r>
-          <w:r>
             <w:fldChar w:fldCharType="begin"/>
-          </w:r>
-          <w:r>
             <w:instrText xml:space="preserve"> PAGEREF _Toc23766 \h </w:instrText>
-          </w:r>
-          <w:r>
             <w:fldChar w:fldCharType="separate"/>
-          </w:r>
-          <w:r>
             <w:t>12</w:t>
-          </w:r>
-          <w:r>
             <w:fldChar w:fldCharType="end"/>
-          </w:r>
-          <w:r>
             <w:fldChar w:fldCharType="end"/>
           </w:r>
         </w:p>
@@ -2083,11 +1439,7 @@
           </w:pPr>
           <w:r>
             <w:fldChar w:fldCharType="begin"/>
-          </w:r>
-          <w:r>
             <w:instrText xml:space="preserve"> HYPERLINK \l _Toc3918 </w:instrText>
-          </w:r>
-          <w:r>
             <w:fldChar w:fldCharType="separate"/>
           </w:r>
           <w:r>
@@ -2098,23 +1450,11 @@
           </w:r>
           <w:r>
             <w:tab/>
-          </w:r>
-          <w:r>
             <w:fldChar w:fldCharType="begin"/>
-          </w:r>
-          <w:r>
             <w:instrText xml:space="preserve"> PAGEREF _Toc3918 \h </w:instrText>
-          </w:r>
-          <w:r>
             <w:fldChar w:fldCharType="separate"/>
-          </w:r>
-          <w:r>
-            <w:t>12</w:t>
-          </w:r>
-          <w:r>
+            <w:t>13</w:t>
             <w:fldChar w:fldCharType="end"/>
-          </w:r>
-          <w:r>
             <w:fldChar w:fldCharType="end"/>
           </w:r>
         </w:p>
@@ -2127,11 +1467,7 @@
           </w:pPr>
           <w:r>
             <w:fldChar w:fldCharType="begin"/>
-          </w:r>
-          <w:r>
             <w:instrText xml:space="preserve"> HYPERLINK \l _Toc25580 </w:instrText>
-          </w:r>
-          <w:r>
             <w:fldChar w:fldCharType="separate"/>
           </w:r>
           <w:r>
@@ -2142,23 +1478,11 @@
           </w:r>
           <w:r>
             <w:tab/>
-          </w:r>
-          <w:r>
             <w:fldChar w:fldCharType="begin"/>
-          </w:r>
-          <w:r>
             <w:instrText xml:space="preserve"> PAGEREF _Toc25580 \h </w:instrText>
-          </w:r>
-          <w:r>
             <w:fldChar w:fldCharType="separate"/>
-          </w:r>
-          <w:r>
-            <w:t>13</w:t>
-          </w:r>
-          <w:r>
+            <w:t>14</w:t>
             <w:fldChar w:fldCharType="end"/>
-          </w:r>
-          <w:r>
             <w:fldChar w:fldCharType="end"/>
           </w:r>
         </w:p>
@@ -2171,11 +1495,7 @@
           </w:pPr>
           <w:r>
             <w:fldChar w:fldCharType="begin"/>
-          </w:r>
-          <w:r>
             <w:instrText xml:space="preserve"> HYPERLINK \l _Toc31538 </w:instrText>
-          </w:r>
-          <w:r>
             <w:fldChar w:fldCharType="separate"/>
           </w:r>
           <w:r>
@@ -2186,23 +1506,11 @@
           </w:r>
           <w:r>
             <w:tab/>
-          </w:r>
-          <w:r>
             <w:fldChar w:fldCharType="begin"/>
-          </w:r>
-          <w:r>
             <w:instrText xml:space="preserve"> PAGEREF _Toc31538 \h </w:instrText>
-          </w:r>
-          <w:r>
             <w:fldChar w:fldCharType="separate"/>
-          </w:r>
-          <w:r>
-            <w:t>13</w:t>
-          </w:r>
-          <w:r>
+            <w:t>14</w:t>
             <w:fldChar w:fldCharType="end"/>
-          </w:r>
-          <w:r>
             <w:fldChar w:fldCharType="end"/>
           </w:r>
         </w:p>
@@ -2215,11 +1523,7 @@
           </w:pPr>
           <w:r>
             <w:fldChar w:fldCharType="begin"/>
-          </w:r>
-          <w:r>
             <w:instrText xml:space="preserve"> HYPERLINK \l _Toc10857 </w:instrText>
-          </w:r>
-          <w:r>
             <w:fldChar w:fldCharType="separate"/>
           </w:r>
           <w:r>
@@ -2230,23 +1534,11 @@
           </w:r>
           <w:r>
             <w:tab/>
-          </w:r>
-          <w:r>
             <w:fldChar w:fldCharType="begin"/>
-          </w:r>
-          <w:r>
             <w:instrText xml:space="preserve"> PAGEREF _Toc10857 \h </w:instrText>
-          </w:r>
-          <w:r>
             <w:fldChar w:fldCharType="separate"/>
-          </w:r>
-          <w:r>
-            <w:t>13</w:t>
-          </w:r>
-          <w:r>
+            <w:t>14</w:t>
             <w:fldChar w:fldCharType="end"/>
-          </w:r>
-          <w:r>
             <w:fldChar w:fldCharType="end"/>
           </w:r>
         </w:p>
@@ -2259,11 +1551,7 @@
           </w:pPr>
           <w:r>
             <w:fldChar w:fldCharType="begin"/>
-          </w:r>
-          <w:r>
             <w:instrText xml:space="preserve"> HYPERLINK \l _Toc24666 </w:instrText>
-          </w:r>
-          <w:r>
             <w:fldChar w:fldCharType="separate"/>
           </w:r>
           <w:r>
@@ -2274,23 +1562,11 @@
           </w:r>
           <w:r>
             <w:tab/>
-          </w:r>
-          <w:r>
             <w:fldChar w:fldCharType="begin"/>
-          </w:r>
-          <w:r>
             <w:instrText xml:space="preserve"> PAGEREF _Toc24666 \h </w:instrText>
-          </w:r>
-          <w:r>
             <w:fldChar w:fldCharType="separate"/>
-          </w:r>
-          <w:r>
             <w:t>13</w:t>
-          </w:r>
-          <w:r>
             <w:fldChar w:fldCharType="end"/>
-          </w:r>
-          <w:r>
             <w:fldChar w:fldCharType="end"/>
           </w:r>
         </w:p>
@@ -2303,11 +1579,7 @@
           </w:pPr>
           <w:r>
             <w:fldChar w:fldCharType="begin"/>
-          </w:r>
-          <w:r>
             <w:instrText xml:space="preserve"> HYPERLINK \l _Toc19386 </w:instrText>
-          </w:r>
-          <w:r>
             <w:fldChar w:fldCharType="separate"/>
           </w:r>
           <w:r>
@@ -2318,23 +1590,11 @@
           </w:r>
           <w:r>
             <w:tab/>
-          </w:r>
-          <w:r>
             <w:fldChar w:fldCharType="begin"/>
-          </w:r>
-          <w:r>
             <w:instrText xml:space="preserve"> PAGEREF _Toc19386 \h </w:instrText>
-          </w:r>
-          <w:r>
             <w:fldChar w:fldCharType="separate"/>
-          </w:r>
-          <w:r>
             <w:t>14</w:t>
-          </w:r>
-          <w:r>
             <w:fldChar w:fldCharType="end"/>
-          </w:r>
-          <w:r>
             <w:fldChar w:fldCharType="end"/>
           </w:r>
         </w:p>
@@ -2347,11 +1607,7 @@
           </w:pPr>
           <w:r>
             <w:fldChar w:fldCharType="begin"/>
-          </w:r>
-          <w:r>
             <w:instrText xml:space="preserve"> HYPERLINK \l _Toc6713 </w:instrText>
-          </w:r>
-          <w:r>
             <w:fldChar w:fldCharType="separate"/>
           </w:r>
           <w:r>
@@ -2362,23 +1618,11 @@
           </w:r>
           <w:r>
             <w:tab/>
-          </w:r>
-          <w:r>
             <w:fldChar w:fldCharType="begin"/>
-          </w:r>
-          <w:r>
             <w:instrText xml:space="preserve"> PAGEREF _Toc6713 \h </w:instrText>
-          </w:r>
-          <w:r>
             <w:fldChar w:fldCharType="separate"/>
-          </w:r>
-          <w:r>
-            <w:t>14</w:t>
-          </w:r>
-          <w:r>
+            <w:t>15</w:t>
             <w:fldChar w:fldCharType="end"/>
-          </w:r>
-          <w:r>
             <w:fldChar w:fldCharType="end"/>
           </w:r>
         </w:p>
@@ -6849,7 +6093,7 @@
         <w:rPr>
           <w:rFonts w:ascii="Arial" w:hAnsi="Arial" w:eastAsia="Arial" w:cs="Arial"/>
         </w:rPr>
-        <w:t xml:space="preserve"> thường gặp của máy đó: nếu chịu đựng ≥ sửa, sự cố được đệm hấp thụ; ngược lại, thiệt hại chắc chắn xảy ra. Hai chỉ số này lấy từ phương pháp stress test chuỗi cung ứng (Time-to-Survive / Time-to-Recover) và dùng để xếp thứ tự sửa máy (trường hợp 2) và đề xuất mức đệm (mục 7.1).</w:t>
+        <w:t xml:space="preserve"> thường gặp của máy đó: nếu chịu đựng ≥ sửa, sự cố được đệm hấp thụ trong ca; ngược lại, thiệt hại chắc chắn xảy ra. Hai chỉ số này lấy từ phương pháp stress test chuỗi cung ứng (Time-to-Survive / Time-to-Recover) và dùng để sàng lọc nhanh thứ tự sửa máy (trường hợp 2) và đề xuất mức đệm (mục 7.1). Lưu ý: đệm hấp thụ chỉ là hoãn thiệt hại – phần đệm bị rút vẫn phải bù lại sau đó. Vì vậy thứ tự sửa cuối cùng được quyết định bằng mô phỏng, tính cả thời gian trả đệm về mức mục tiêu (xem trường hợp 2).</w:t>
       </w:r>
     </w:p>
     <w:p>
@@ -10336,7 +9580,7 @@
                 <w:sz w:val="19"/>
                 <w:szCs w:val="19"/>
               </w:rPr>
-              <w:t>Đệm B1 lúc 16:00</w:t>
+              <w:t>Sản lượng Gia công lúc 16:00</w:t>
             </w:r>
           </w:p>
         </w:tc>
@@ -10363,7 +9607,7 @@
                 <w:sz w:val="19"/>
                 <w:szCs w:val="19"/>
               </w:rPr>
-              <w:t>Còn 12 sp (chưa cạn)</w:t>
+              <w:t>848 (thiếu 112)</w:t>
             </w:r>
           </w:p>
         </w:tc>
@@ -10390,7 +9634,7 @@
                 <w:sz w:val="19"/>
                 <w:szCs w:val="19"/>
               </w:rPr>
-              <w:t>Còn 218 sp</w:t>
+              <w:t>792 (thiếu 168)</w:t>
             </w:r>
           </w:p>
         </w:tc>
@@ -10435,7 +9679,7 @@
                 <w:sz w:val="19"/>
                 <w:szCs w:val="19"/>
               </w:rPr>
-              <w:t>Sản lượng ca</w:t>
+              <w:t>Đệm B1 lúc 16:00</w:t>
             </w:r>
           </w:p>
         </w:tc>
@@ -10457,12 +9701,12 @@
             <w:r>
               <w:rPr>
                 <w:rFonts w:ascii="Arial" w:hAnsi="Arial" w:eastAsia="Arial" w:cs="Arial"/>
-                <w:b/>
-                <w:bCs/>
-                <w:sz w:val="19"/>
-                <w:szCs w:val="19"/>
-              </w:rPr>
-              <w:t>848 (thiếu 112)</w:t>
+                <w:b w:val="0"/>
+                <w:bCs w:val="0"/>
+                <w:sz w:val="19"/>
+                <w:szCs w:val="19"/>
+              </w:rPr>
+              <w:t>Còn 12 sp – thiếu 188 so với mức mục tiêu 200</w:t>
             </w:r>
           </w:p>
         </w:tc>
@@ -10489,7 +9733,7 @@
                 <w:sz w:val="19"/>
                 <w:szCs w:val="19"/>
               </w:rPr>
-              <w:t>792 (thiếu 168)</w:t>
+              <w:t>Còn 218 sp (trên mục tiêu)</w:t>
             </w:r>
           </w:p>
         </w:tc>
@@ -10534,7 +9778,7 @@
                 <w:sz w:val="19"/>
                 <w:szCs w:val="19"/>
               </w:rPr>
-              <w:t>Tăng ca</w:t>
+              <w:t>Sản lượng ca sau khi trả đệm về mục tiêu</w:t>
             </w:r>
           </w:p>
         </w:tc>
@@ -10561,8 +9805,25 @@
                 <w:sz w:val="19"/>
                 <w:szCs w:val="19"/>
               </w:rPr>
-              <w:t xml:space="preserve">≈ 1 giờ 20 phút; giờ đầu bị Dập giới hạn vì B1 gần cạn và D1 chưa sửa xong → </w:t>
-            </w:r>
+              <w:t>≈ 660</w:t>
+            </w:r>
+          </w:p>
+        </w:tc>
+        <w:tc>
+          <w:tcPr>
+            <w:tcW w:w="3856" w:type="dxa"/>
+            <w:shd w:val="clear" w:color="auto" w:fill="FFFFFF"/>
+            <w:tcMar>
+              <w:top w:w="60" w:type="dxa"/>
+              <w:left w:w="100" w:type="dxa"/>
+              <w:bottom w:w="60" w:type="dxa"/>
+              <w:right w:w="100" w:type="dxa"/>
+            </w:tcMar>
+          </w:tcPr>
+          <w:p>
+            <w:pPr>
+              <w:spacing w:after="40"/>
+            </w:pPr>
             <w:r>
               <w:rPr>
                 <w:rFonts w:ascii="Arial" w:hAnsi="Arial" w:eastAsia="Arial" w:cs="Arial"/>
@@ -10571,7 +9832,89 @@
                 <w:sz w:val="19"/>
                 <w:szCs w:val="19"/>
               </w:rPr>
-              <w:t>Dập cũng phải tăng ca</w:t>
+              <w:t>792</w:t>
+            </w:r>
+          </w:p>
+        </w:tc>
+      </w:tr>
+      <w:tr>
+        <w:tblPrEx>
+          <w:tblBorders>
+            <w:top w:val="single" w:color="auto" w:sz="4" w:space="0"/>
+            <w:left w:val="single" w:color="auto" w:sz="4" w:space="0"/>
+            <w:bottom w:val="single" w:color="auto" w:sz="4" w:space="0"/>
+            <w:right w:val="single" w:color="auto" w:sz="4" w:space="0"/>
+            <w:insideH w:val="single" w:color="auto" w:sz="4" w:space="0"/>
+            <w:insideV w:val="single" w:color="auto" w:sz="4" w:space="0"/>
+          </w:tblBorders>
+          <w:tblCellMar>
+            <w:top w:w="0" w:type="dxa"/>
+            <w:left w:w="10" w:type="dxa"/>
+            <w:bottom w:w="0" w:type="dxa"/>
+            <w:right w:w="10" w:type="dxa"/>
+          </w:tblCellMar>
+        </w:tblPrEx>
+        <w:tc>
+          <w:tcPr>
+            <w:tcW w:w="1927" w:type="dxa"/>
+            <w:shd w:val="clear" w:color="auto" w:fill="FFFFFF"/>
+            <w:tcMar>
+              <w:top w:w="60" w:type="dxa"/>
+              <w:left w:w="100" w:type="dxa"/>
+              <w:bottom w:w="60" w:type="dxa"/>
+              <w:right w:w="100" w:type="dxa"/>
+            </w:tcMar>
+          </w:tcPr>
+          <w:p>
+            <w:pPr>
+              <w:spacing w:after="40"/>
+            </w:pPr>
+            <w:r>
+              <w:rPr>
+                <w:rFonts w:ascii="Arial" w:hAnsi="Arial" w:eastAsia="Arial" w:cs="Arial"/>
+                <w:b w:val="0"/>
+                <w:bCs w:val="0"/>
+                <w:sz w:val="19"/>
+                <w:szCs w:val="19"/>
+              </w:rPr>
+              <w:t>Tăng ca để đủ kế hoạch và trả đệm về mục tiêu</w:t>
+            </w:r>
+          </w:p>
+        </w:tc>
+        <w:tc>
+          <w:tcPr>
+            <w:tcW w:w="3855" w:type="dxa"/>
+            <w:shd w:val="clear" w:color="auto" w:fill="FFFFFF"/>
+            <w:tcMar>
+              <w:top w:w="60" w:type="dxa"/>
+              <w:left w:w="100" w:type="dxa"/>
+              <w:bottom w:w="60" w:type="dxa"/>
+              <w:right w:w="100" w:type="dxa"/>
+            </w:tcMar>
+          </w:tcPr>
+          <w:p>
+            <w:pPr>
+              <w:spacing w:after="40"/>
+            </w:pPr>
+            <w:r>
+              <w:rPr>
+                <w:rFonts w:ascii="Arial" w:hAnsi="Arial" w:eastAsia="Arial" w:cs="Arial"/>
+                <w:b w:val="0"/>
+                <w:bCs w:val="0"/>
+                <w:sz w:val="19"/>
+                <w:szCs w:val="19"/>
+              </w:rPr>
+              <w:t xml:space="preserve">≈ 3 giờ: D1 sửa xong 17:00, giờ đầu Dập chỉ còn D2 60 sp/h; sau đó Dập chạy chuẩn 120 = nhịp chuyền nên </w:t>
+            </w:r>
+            <w:r>
+              <w:rPr>
+                <w:rFonts w:ascii="Arial" w:hAnsi="Arial" w:eastAsia="Arial" w:cs="Arial"/>
+                <w:b/>
+                <w:bCs/>
+                <w:sz w:val="19"/>
+                <w:szCs w:val="19"/>
+              </w:rPr>
+              <w:t>B1 chỉ đầy lại được trong giờ tăng ca</w:t>
             </w:r>
           </w:p>
         </w:tc>
@@ -10593,12 +9936,22 @@
             <w:r>
               <w:rPr>
                 <w:rFonts w:ascii="Arial" w:hAnsi="Arial" w:eastAsia="Arial" w:cs="Arial"/>
-                <w:b w:val="0"/>
-                <w:bCs w:val="0"/>
-                <w:sz w:val="19"/>
-                <w:szCs w:val="19"/>
-              </w:rPr>
-              <w:t>≈ 1 giờ 45 phút; giờ đầu M2 chưa sửa xong, chỉ chạy 80 sp/h</w:t>
+                <w:b/>
+                <w:bCs/>
+                <w:sz w:val="19"/>
+                <w:szCs w:val="19"/>
+              </w:rPr>
+              <w:t>≈ 1 giờ 45 phút</w:t>
+            </w:r>
+            <w:r>
+              <w:rPr>
+                <w:rFonts w:ascii="Arial" w:hAnsi="Arial" w:eastAsia="Arial" w:cs="Arial"/>
+                <w:b w:val="0"/>
+                <w:bCs w:val="0"/>
+                <w:sz w:val="19"/>
+                <w:szCs w:val="19"/>
+              </w:rPr>
+              <w:t>: giờ đầu M2 chưa sửa xong, Gia công chỉ chạy 80 sp/h</w:t>
             </w:r>
           </w:p>
         </w:tc>
@@ -10625,7 +9978,13 @@
           <w:b/>
           <w:bCs/>
         </w:rPr>
-        <w:t>Sửa M2 trước: cứu thêm 56 sp và bớt khoảng 25 phút tăng ca.</w:t>
+        <w:t>Sửa D1 trước: ít hơn khoảng 1 giờ 15 phút tăng ca.</w:t>
+      </w:r>
+      <w:r>
+        <w:rPr>
+          <w:rFonts w:ascii="Arial" w:hAnsi="Arial" w:eastAsia="Arial" w:cs="Arial"/>
+        </w:rPr>
+        <w:t xml:space="preserve"> Nếu chỉ nhìn sản lượng Gia công lúc 16:00 thì sửa M2 trước có vẻ hơn (848 so với 792), nhưng phần hơn đó lấy từ đệm B1 (rút từ 200 xuống 12) và phải trả lại sau ca.</w:t>
       </w:r>
     </w:p>
     <w:p>
@@ -10639,12 +9998,6 @@
           <w:bCs/>
         </w:rPr>
         <w:t>Vì sao:</w:t>
-      </w:r>
-      <w:r>
-        <w:rPr>
-          <w:rFonts w:ascii="Arial" w:hAnsi="Arial" w:eastAsia="Arial" w:cs="Arial"/>
-        </w:rPr>
-        <w:t xml:space="preserve"> so thời gian chịu đựng của đệm với thời gian sửa:</w:t>
       </w:r>
     </w:p>
     <w:p>
@@ -10660,7 +10013,7 @@
         <w:rPr>
           <w:rFonts w:ascii="Arial" w:hAnsi="Arial" w:eastAsia="Arial" w:cs="Arial"/>
         </w:rPr>
-        <w:t xml:space="preserve">D1 hỏng, Dập còn 70 sp/h. Đệm B1 có 200 sp đỡ được khoảng 9 giờ (khi Gia công chạy 92) hoặc 4 giờ (khi Gia công chạy 120) – đều lâu hơn 3 giờ sửa D1 → </w:t>
+        <w:t xml:space="preserve">Thời gian chịu đựng cho thấy </w:t>
       </w:r>
       <w:r>
         <w:rPr>
@@ -10674,7 +10027,35 @@
         <w:rPr>
           <w:rFonts w:ascii="Arial" w:hAnsi="Arial" w:eastAsia="Arial" w:cs="Arial"/>
         </w:rPr>
-        <w:t>.</w:t>
+        <w:t xml:space="preserve"> </w:t>
+      </w:r>
+      <w:r>
+        <w:rPr>
+          <w:rFonts w:ascii="Arial" w:hAnsi="Arial" w:eastAsia="Arial" w:cs="Arial"/>
+          <w:i/>
+          <w:iCs/>
+        </w:rPr>
+        <w:t>trong ca</w:t>
+      </w:r>
+      <w:r>
+        <w:rPr>
+          <w:rFonts w:ascii="Arial" w:hAnsi="Arial" w:eastAsia="Arial" w:cs="Arial"/>
+        </w:rPr>
+        <w:t xml:space="preserve">: D1 hỏng, Dập còn 70 sp/h; đệm B1 200 sp đỡ được khoảng 9 giờ (Gia công chạy 92) hoặc 4 giờ (Gia công chạy 120) – lâu hơn 3 giờ sửa D1. Còn </w:t>
+      </w:r>
+      <w:r>
+        <w:rPr>
+          <w:rFonts w:ascii="Arial" w:hAnsi="Arial" w:eastAsia="Arial" w:cs="Arial"/>
+          <w:b/>
+          <w:bCs/>
+        </w:rPr>
+        <w:t>M2 thì không chờ được</w:t>
+      </w:r>
+      <w:r>
+        <w:rPr>
+          <w:rFonts w:ascii="Arial" w:hAnsi="Arial" w:eastAsia="Arial" w:cs="Arial"/>
+        </w:rPr>
+        <w:t>: Gia công thiếu 28 sp/h, đệm B2 60 sp chỉ đỡ khoảng 2 giờ, ngắn hơn 4 giờ sửa.</w:t>
       </w:r>
     </w:p>
     <w:p>
@@ -10690,7 +10071,7 @@
         <w:rPr>
           <w:rFonts w:ascii="Arial" w:hAnsi="Arial" w:eastAsia="Arial" w:cs="Arial"/>
         </w:rPr>
-        <w:t xml:space="preserve">M2 hỏng, Gia công thiếu 28 sp/h so với Lắp ráp. Đệm B2 chỉ có 60 sp → đỡ được khoảng 2 giờ, ngắn hơn 4 giờ sửa M2 → </w:t>
+        <w:t xml:space="preserve">Nhưng dây chuyền cân bằng (mọi công đoạn chuẩn 120 sp/h): mỗi giờ D1 hỏng, Dập hụt 50 sp; mỗi giờ M2 hỏng, Gia công chỉ hụt 28 sp. Đệm B1 chỉ </w:t>
       </w:r>
       <w:r>
         <w:rPr>
@@ -10698,13 +10079,29 @@
           <w:b/>
           <w:bCs/>
         </w:rPr>
-        <w:t>M2 không chờ được</w:t>
-      </w:r>
-      <w:r>
-        <w:rPr>
-          <w:rFonts w:ascii="Arial" w:hAnsi="Arial" w:eastAsia="Arial" w:cs="Arial"/>
-        </w:rPr>
-        <w:t>.</w:t>
+        <w:t>dời thiệt hại của D1 sang sau 16:00</w:t>
+      </w:r>
+      <w:r>
+        <w:rPr>
+          <w:rFonts w:ascii="Arial" w:hAnsi="Arial" w:eastAsia="Arial" w:cs="Arial"/>
+        </w:rPr>
+        <w:t>. Khi tính cả việc trả đệm, máy hụt nhiều hơn mỗi giờ và sửa nhanh hơn (D1) nên được sửa trước.</w:t>
+      </w:r>
+    </w:p>
+    <w:p>
+      <w:pPr>
+        <w:pStyle w:val="18"/>
+        <w:numPr>
+          <w:ilvl w:val="0"/>
+          <w:numId w:val="1"/>
+        </w:numPr>
+        <w:spacing w:after="80" w:line="276" w:lineRule="auto"/>
+      </w:pPr>
+      <w:r>
+        <w:rPr>
+          <w:rFonts w:ascii="Arial" w:hAnsi="Arial" w:eastAsia="Arial" w:cs="Arial"/>
+        </w:rPr>
+        <w:t>Nếu ca sau Dập có thể chạy trên chuẩn (tối đa 140) để tự bù B1 mà không cần tăng ca thì khoảng cách giữa hai phương án hẹp lại. Hệ thống hiển thị cả hai thước đo để Bảo trì và Kế hoạch quyết định.</w:t>
       </w:r>
     </w:p>
     <w:p>
@@ -10728,7 +10125,21 @@
         <w:rPr>
           <w:rFonts w:ascii="Arial" w:hAnsi="Arial" w:eastAsia="Arial" w:cs="Arial"/>
         </w:rPr>
-        <w:t xml:space="preserve"> thứ tự sửa quyết định bởi thiệt hại lan truyền, không phải thứ tự báo hỏng hay cảm tính.</w:t>
+        <w:t xml:space="preserve"> thứ tự sửa quyết định bởi thiệt hại lan truyền </w:t>
+      </w:r>
+      <w:r>
+        <w:rPr>
+          <w:rFonts w:ascii="Arial" w:hAnsi="Arial" w:eastAsia="Arial" w:cs="Arial"/>
+          <w:b/>
+          <w:bCs/>
+        </w:rPr>
+        <w:t>tính đến khi các đệm được trả về mức mục tiêu</w:t>
+      </w:r>
+      <w:r>
+        <w:rPr>
+          <w:rFonts w:ascii="Arial" w:hAnsi="Arial" w:eastAsia="Arial" w:cs="Arial"/>
+        </w:rPr>
+        <w:t xml:space="preserve"> – không phải thứ tự báo hỏng, cảm tính, hay chỉ sản lượng cuối ca. (Kiểm chứng bằng mô phỏng ở bản demo; bản nháp tính tay trước đây chọn M2 vì chưa tính phần trả đệm B1.)</w:t>
       </w:r>
     </w:p>
     <w:p>
@@ -11491,7 +10902,7 @@
                 <w:sz w:val="19"/>
                 <w:szCs w:val="19"/>
               </w:rPr>
-              <w:t>Đổi thứ tự như trên. Ngày mai còn 450 X (D-102) + 500 Y (D-201) = 950 sp, vừa một ca – giữ trống kế hoạch ngày mai.</w:t>
+              <w:t>Đổi thứ tự như trên. Ngày mai còn 450 X (D-102) + 500 Y (D-201) = 950 sp, cộng 1 lần đổi mã X → Y (20 phút ≈ 40 sp) = 990 sp &gt; 960 → không vừa một ca. Hai cách: tăng ca khoảng 40 phút hôm nay để bù 80 sp, hoặc đổi thứ tự kết hợp tăng tốc Lắp ráp trong giới hạn cho phép (ca hôm nay đạt khoảng 920 sp, ngày mai vừa một ca, không cần tăng ca).</w:t>
             </w:r>
           </w:p>
         </w:tc>
@@ -12495,7 +11906,7 @@
         <w:rPr>
           <w:rFonts w:ascii="Arial" w:hAnsi="Arial" w:eastAsia="Arial" w:cs="Arial"/>
         </w:rPr>
-        <w:t xml:space="preserve"> – hệ thống phát hiện được vì mọi thứ nằm trên cùng một bản đồ.</w:t>
+        <w:t xml:space="preserve"> – hệ thống phát hiện được vì mọi thứ nằm trên cùng một bản đồ. Với số liệu của dây chuyền này (kho 400 + lô 600 = 1000 L-A, cần 960 + 300 = 1260) thì kho không đủ: phải đặt gấp 260 L-A, về trước 15:50 (phương án A) hoặc 16:20 (phương án B). Hai mốc 18:00 và 18:30 ở trên đều đã giả định có lô bổ sung này.</w:t>
       </w:r>
     </w:p>
     <w:p>
@@ -13396,7 +12807,7 @@
         <w:rPr>
           <w:rFonts w:ascii="Arial" w:hAnsi="Arial" w:eastAsia="Arial" w:cs="Arial"/>
         </w:rPr>
-        <w:t xml:space="preserve"> giữ 88 sp → đơn đang chạy thiếu 88; kho thành phẩm bù 30 → thiếu 58. M3 dừng 1 giờ để kiểm tra → M1, M2 chạy tối đa 94 sp/h → thiếu thêm 26. Tổng thiếu 84 → </w:t>
+        <w:t xml:space="preserve"> giữ 88 sp → đơn đang chạy thiếu 88. M3 dừng 1 giờ để kiểm tra → M1, M2 chạy tối đa 94 sp/h → thiếu thêm 26. Tổng thiếu 114 sp. Kho thành phẩm (30 sp) cũng là một đệm phải trả về mức mục tiêu nên không dùng để giảm giờ tăng ca (cùng quy ước với mục 5) → </w:t>
       </w:r>
       <w:r>
         <w:rPr>
@@ -13404,13 +12815,51 @@
           <w:b/>
           <w:bCs/>
         </w:rPr>
-        <w:t>tăng ca khoảng 42 phút</w:t>
-      </w:r>
-      <w:r>
-        <w:rPr>
-          <w:rFonts w:ascii="Arial" w:hAnsi="Arial" w:eastAsia="Arial" w:cs="Arial"/>
-        </w:rPr>
-        <w:t>.</w:t>
+        <w:t>tăng ca khoảng 57 phút</w:t>
+      </w:r>
+      <w:r>
+        <w:rPr>
+          <w:rFonts w:ascii="Arial" w:hAnsi="Arial" w:eastAsia="Arial" w:cs="Arial"/>
+        </w:rPr>
+        <w:t>; nếu sau 15:00 cả ba máy chạy tăng tốc để đuổi kịp kế hoạch thì còn khoảng 48 phút. Kho thành phẩm vẫn được tính khi kiểm tra đơn: D-101 vẫn đủ.</w:t>
+      </w:r>
+    </w:p>
+    <w:p>
+      <w:pPr>
+        <w:pStyle w:val="18"/>
+        <w:numPr>
+          <w:ilvl w:val="0"/>
+          <w:numId w:val="1"/>
+        </w:numPr>
+        <w:spacing w:after="80" w:line="276" w:lineRule="auto"/>
+      </w:pPr>
+      <w:r>
+        <w:rPr>
+          <w:rFonts w:ascii="Arial" w:hAnsi="Arial" w:eastAsia="Arial" w:cs="Arial"/>
+          <w:b/>
+          <w:bCs/>
+        </w:rPr>
+        <w:t>Kiểm tra chéo linh kiện:</w:t>
+      </w:r>
+      <w:r>
+        <w:rPr>
+          <w:rFonts w:ascii="Arial" w:hAnsi="Arial" w:eastAsia="Arial" w:cs="Arial"/>
+        </w:rPr>
+        <w:t xml:space="preserve"> làm bù 88 sp X nghĩa là cần 960 + 88 = 1048 L-A, trong khi cả ngày chỉ có 1000 → phải </w:t>
+      </w:r>
+      <w:r>
+        <w:rPr>
+          <w:rFonts w:ascii="Arial" w:hAnsi="Arial" w:eastAsia="Arial" w:cs="Arial"/>
+          <w:b/>
+          <w:bCs/>
+        </w:rPr>
+        <w:t>đặt gấp 48 L-A</w:t>
+      </w:r>
+      <w:r>
+        <w:rPr>
+          <w:rFonts w:ascii="Arial" w:hAnsi="Arial" w:eastAsia="Arial" w:cs="Arial"/>
+        </w:rPr>
+        <w:t>, về trước khoảng 16:20.</w:t>
       </w:r>
     </w:p>
     <w:p>
@@ -14022,6 +13471,30 @@
           <w:rFonts w:ascii="Arial" w:hAnsi="Arial" w:eastAsia="Arial" w:cs="Arial"/>
         </w:rPr>
         <w:t>.</w:t>
+      </w:r>
+    </w:p>
+    <w:p>
+      <w:pPr>
+        <w:pBdr>
+          <w:left w:val="single" w:color="2F5597" w:sz="18" w:space="8"/>
+        </w:pBdr>
+        <w:shd w:val="clear" w:color="auto" w:fill="EEF3FA"/>
+        <w:spacing w:before="80" w:after="160" w:line="288" w:lineRule="auto"/>
+        <w:ind w:left="200" w:right="120"/>
+      </w:pPr>
+      <w:r>
+        <w:rPr>
+          <w:rFonts w:ascii="Arial" w:hAnsi="Arial" w:eastAsia="Arial" w:cs="Arial"/>
+          <w:b/>
+          <w:bCs/>
+        </w:rPr>
+        <w:t>Mức: Vàng</w:t>
+      </w:r>
+      <w:r>
+        <w:rPr>
+          <w:rFonts w:ascii="Arial" w:hAnsi="Arial" w:eastAsia="Arial" w:cs="Arial"/>
+        </w:rPr>
+        <w:t xml:space="preserve"> – còn phương án giữ đơn đúng hạn (thuê xe ngoài chạy đúng giờ cũ, hàng đến 18:30). Chuyến 17:30 tuyến gần đến đúng 19:00, chỉ chở được khoảng 200/500 sp. Chỉ chuyển Đỏ nếu không có xe nào kịp, khi đó báo khách ngay và giao tách đợt.</w:t>
       </w:r>
     </w:p>
     <w:p>
@@ -14496,7 +13969,7 @@
                 <w:sz w:val="19"/>
                 <w:szCs w:val="19"/>
               </w:rPr>
-              <w:t>Ưu tiên sửa theo thiệt hại lan truyền</w:t>
+              <w:t>Ưu tiên sửa theo thiệt hại lan truyền, tính cả việc trả đệm về mục tiêu</w:t>
             </w:r>
           </w:p>
         </w:tc>
@@ -14649,7 +14122,7 @@
                 <w:sz w:val="19"/>
                 <w:szCs w:val="19"/>
               </w:rPr>
-              <w:t>Lan ngược; đổi thứ tự; ngưỡng thời gian an toàn</w:t>
+              <w:t>Lan ngược; đổi thứ tự; ngưỡng thời gian an toàn; tính cả thời gian đổi mã ngày mai</w:t>
             </w:r>
           </w:p>
         </w:tc>
@@ -15268,27 +14741,27 @@
         <w:tc>
           <w:tcPr>
             <w:tcW w:w="1063" w:type="dxa"/>
-            <w:shd w:val="clear" w:color="auto" w:fill="FFC7CE"/>
-            <w:tcMar>
-              <w:top w:w="60" w:type="dxa"/>
-              <w:left w:w="100" w:type="dxa"/>
-              <w:bottom w:w="60" w:type="dxa"/>
-              <w:right w:w="100" w:type="dxa"/>
-            </w:tcMar>
-          </w:tcPr>
-          <w:p>
-            <w:pPr>
-              <w:spacing w:after="40"/>
-            </w:pPr>
-            <w:r>
-              <w:rPr>
-                <w:rFonts w:ascii="Arial" w:hAnsi="Arial" w:eastAsia="Arial" w:cs="Arial"/>
-                <w:b w:val="0"/>
-                <w:bCs w:val="0"/>
-                <w:sz w:val="19"/>
-                <w:szCs w:val="19"/>
-              </w:rPr>
-              <w:t>Đỏ</w:t>
+            <w:shd w:val="clear" w:color="auto" w:fill="FFEB9C"/>
+            <w:tcMar>
+              <w:top w:w="60" w:type="dxa"/>
+              <w:left w:w="100" w:type="dxa"/>
+              <w:bottom w:w="60" w:type="dxa"/>
+              <w:right w:w="100" w:type="dxa"/>
+            </w:tcMar>
+          </w:tcPr>
+          <w:p>
+            <w:pPr>
+              <w:spacing w:after="40"/>
+            </w:pPr>
+            <w:r>
+              <w:rPr>
+                <w:rFonts w:ascii="Arial" w:hAnsi="Arial" w:eastAsia="Arial" w:cs="Arial"/>
+                <w:b w:val="0"/>
+                <w:bCs w:val="0"/>
+                <w:sz w:val="19"/>
+                <w:szCs w:val="19"/>
+              </w:rPr>
+              <w:t>Vàng</w:t>
             </w:r>
           </w:p>
         </w:tc>
@@ -17476,7 +16949,7 @@
         <w:rPr>
           <w:rFonts w:ascii="Arial" w:hAnsi="Arial" w:eastAsia="Arial" w:cs="Arial"/>
         </w:rPr>
-        <w:t>Mọi số liệu trong tài liệu là minh họa, tính tay; cần chạy lại bằng mô phỏng.</w:t>
+        <w:t>Mọi số liệu trong tài liệu là minh họa. Đã chạy lại bằng engine mô phỏng của bản demo (demo/, bước 1 phút): các con số khớp, trừ 5 chỗ đã sửa (xem mục 10).</w:t>
       </w:r>
     </w:p>
     <w:p>
@@ -17874,6 +17347,193 @@
           <w:rFonts w:ascii="Arial" w:hAnsi="Arial" w:eastAsia="Arial" w:cs="Arial"/>
         </w:rPr>
         <w:t>Số "sửa M3 cứu 200, sửa M7 cứu 40" trong tài liệu cũ là minh họa không cùng dây chuyền với tài liệu này – đã thay bằng ví dụ M2/M5 thống nhất.</w:t>
+      </w:r>
+    </w:p>
+    <w:p>
+      <w:pPr>
+        <w:spacing w:after="120" w:line="288" w:lineRule="auto"/>
+      </w:pPr>
+      <w:r>
+        <w:rPr>
+          <w:rFonts w:ascii="Arial" w:hAnsi="Arial" w:eastAsia="Arial" w:cs="Arial"/>
+          <w:b/>
+          <w:bCs/>
+        </w:rPr>
+        <w:t>Kiểm chứng bằng mô phỏng</w:t>
+      </w:r>
+      <w:r>
+        <w:rPr>
+          <w:rFonts w:ascii="Arial" w:hAnsi="Arial" w:eastAsia="Arial" w:cs="Arial"/>
+        </w:rPr>
+        <w:t xml:space="preserve"> (bản demo trong demo/, mỗi con số có một test). Năm chỗ sửa so với bản tính tay:</w:t>
+      </w:r>
+    </w:p>
+    <w:p>
+      <w:pPr>
+        <w:pStyle w:val="18"/>
+        <w:numPr>
+          <w:ilvl w:val="0"/>
+          <w:numId w:val="1"/>
+        </w:numPr>
+        <w:spacing w:after="80" w:line="276" w:lineRule="auto"/>
+      </w:pPr>
+      <w:r>
+        <w:rPr>
+          <w:rFonts w:ascii="Arial" w:hAnsi="Arial" w:eastAsia="Arial" w:cs="Arial"/>
+          <w:b/>
+          <w:bCs/>
+        </w:rPr>
+        <w:t>Trường hợp 2:</w:t>
+      </w:r>
+      <w:r>
+        <w:rPr>
+          <w:rFonts w:ascii="Arial" w:hAnsi="Arial" w:eastAsia="Arial" w:cs="Arial"/>
+        </w:rPr>
+        <w:t xml:space="preserve"> đổi kết luận từ "sửa M2 trước" sang "sửa D1 trước". Sửa M2 trước rút đệm B1 xuống 12 (thiếu 188 so với mục tiêu), nên sau khi trả đệm chỉ còn khoảng 660 sp và cần khoảng 3 giờ tăng ca, so với 792 sp và 1 giờ 45 phút khi sửa D1 trước.</w:t>
+      </w:r>
+    </w:p>
+    <w:p>
+      <w:pPr>
+        <w:pStyle w:val="18"/>
+        <w:numPr>
+          <w:ilvl w:val="0"/>
+          <w:numId w:val="1"/>
+        </w:numPr>
+        <w:spacing w:after="80" w:line="276" w:lineRule="auto"/>
+      </w:pPr>
+      <w:r>
+        <w:rPr>
+          <w:rFonts w:ascii="Arial" w:hAnsi="Arial" w:eastAsia="Arial" w:cs="Arial"/>
+          <w:b/>
+          <w:bCs/>
+        </w:rPr>
+        <w:t>Trường hợp 2:</w:t>
+      </w:r>
+      <w:r>
+        <w:rPr>
+          <w:rFonts w:ascii="Arial" w:hAnsi="Arial" w:eastAsia="Arial" w:cs="Arial"/>
+        </w:rPr>
+        <w:t xml:space="preserve"> giờ tăng ca khi sửa M2 trước đổi từ 1 giờ 20 thành khoảng 3 giờ. Bản cũ chỉ bù 112 sp ở Gia công, chưa bù B1.</w:t>
+      </w:r>
+    </w:p>
+    <w:p>
+      <w:pPr>
+        <w:pStyle w:val="18"/>
+        <w:numPr>
+          <w:ilvl w:val="0"/>
+          <w:numId w:val="1"/>
+        </w:numPr>
+        <w:spacing w:after="80" w:line="276" w:lineRule="auto"/>
+      </w:pPr>
+      <w:r>
+        <w:rPr>
+          <w:rFonts w:ascii="Arial" w:hAnsi="Arial" w:eastAsia="Arial" w:cs="Arial"/>
+          <w:b/>
+          <w:bCs/>
+        </w:rPr>
+        <w:t>Trường hợp 3:</w:t>
+      </w:r>
+      <w:r>
+        <w:rPr>
+          <w:rFonts w:ascii="Arial" w:hAnsi="Arial" w:eastAsia="Arial" w:cs="Arial"/>
+        </w:rPr>
+        <w:t xml:space="preserve"> ngày mai 950 sp cộng 1 lần đổi mã (≈ 40 sp) = 990 &gt; 960, không vừa một ca. Thêm hai cách xử lý: tăng ca khoảng 40 phút hôm nay, hoặc đổi thứ tự kết hợp tăng tốc.</w:t>
+      </w:r>
+    </w:p>
+    <w:p>
+      <w:pPr>
+        <w:pStyle w:val="18"/>
+        <w:numPr>
+          <w:ilvl w:val="0"/>
+          <w:numId w:val="1"/>
+        </w:numPr>
+        <w:spacing w:after="80" w:line="276" w:lineRule="auto"/>
+      </w:pPr>
+      <w:r>
+        <w:rPr>
+          <w:rFonts w:ascii="Arial" w:hAnsi="Arial" w:eastAsia="Arial" w:cs="Arial"/>
+          <w:b/>
+          <w:bCs/>
+        </w:rPr>
+        <w:t>Trường hợp 6:</w:t>
+      </w:r>
+      <w:r>
+        <w:rPr>
+          <w:rFonts w:ascii="Arial" w:hAnsi="Arial" w:eastAsia="Arial" w:cs="Arial"/>
+        </w:rPr>
+        <w:t xml:space="preserve"> tăng ca đổi từ 42 phút thành khoảng 57 phút. Bản cũ trừ kho thành phẩm 30 sp ở đây nhưng không trừ ở mục 5; nay thống nhất không trừ (kho thành phẩm cũng là đệm phải trả về mục tiêu). Thêm kiểm tra chéo: phải đặt gấp 48 L-A.</w:t>
+      </w:r>
+    </w:p>
+    <w:p>
+      <w:pPr>
+        <w:pStyle w:val="18"/>
+        <w:numPr>
+          <w:ilvl w:val="0"/>
+          <w:numId w:val="1"/>
+        </w:numPr>
+        <w:spacing w:after="80" w:line="276" w:lineRule="auto"/>
+      </w:pPr>
+      <w:r>
+        <w:rPr>
+          <w:rFonts w:ascii="Arial" w:hAnsi="Arial" w:eastAsia="Arial" w:cs="Arial"/>
+          <w:b/>
+          <w:bCs/>
+        </w:rPr>
+        <w:t>Trường hợp 7:</w:t>
+      </w:r>
+      <w:r>
+        <w:rPr>
+          <w:rFonts w:ascii="Arial" w:hAnsi="Arial" w:eastAsia="Arial" w:cs="Arial"/>
+        </w:rPr>
+        <w:t xml:space="preserve"> mức Đỏ đổi thành Vàng, vì vẫn còn phương án giữ đơn đúng hạn (thuê xe ngoài), đúng theo định nghĩa ở mục 4.5.</w:t>
+      </w:r>
+    </w:p>
+    <w:p>
+      <w:pPr>
+        <w:pStyle w:val="18"/>
+        <w:numPr>
+          <w:ilvl w:val="0"/>
+          <w:numId w:val="1"/>
+        </w:numPr>
+        <w:spacing w:after="80" w:line="276" w:lineRule="auto"/>
+      </w:pPr>
+      <w:r>
+        <w:rPr>
+          <w:rFonts w:ascii="Arial" w:hAnsi="Arial" w:eastAsia="Arial" w:cs="Arial"/>
+          <w:b/>
+          <w:bCs/>
+        </w:rPr>
+        <w:t>Bổ sung</w:t>
+      </w:r>
+      <w:r>
+        <w:rPr>
+          <w:rFonts w:ascii="Arial" w:hAnsi="Arial" w:eastAsia="Arial" w:cs="Arial"/>
+        </w:rPr>
+        <w:t xml:space="preserve"> (không đổi con số): trường hợp 4 với kho L-A của dây chuyền này phải đặt gấp 260 L-A thì mới đạt 18:00 / 18:30.</w:t>
+      </w:r>
+    </w:p>
+    <w:p>
+      <w:pPr>
+        <w:pStyle w:val="18"/>
+        <w:numPr>
+          <w:ilvl w:val="0"/>
+          <w:numId w:val="1"/>
+        </w:numPr>
+        <w:spacing w:after="80" w:line="276" w:lineRule="auto"/>
+      </w:pPr>
+      <w:r>
+        <w:rPr>
+          <w:rFonts w:ascii="Arial" w:hAnsi="Arial" w:eastAsia="Arial" w:cs="Arial"/>
+          <w:b/>
+          <w:bCs/>
+        </w:rPr>
+        <w:t>Quy ước sản lượng</w:t>
+      </w:r>
+      <w:r>
+        <w:rPr>
+          <w:rFonts w:ascii="Arial" w:hAnsi="Arial" w:eastAsia="Arial" w:cs="Arial"/>
+        </w:rPr>
+        <w:t xml:space="preserve"> áp dụng cho mọi đệm, kể cả kho thành phẩm: phần đệm bị rút dưới mục tiêu không được tính là sản lượng cứu được. Kho thành phẩm vẫn được dùng khi kiểm tra đơn hàng.</w:t>
       </w:r>
     </w:p>
     <w:p>

</xml_diff>

<commit_message>
Update the D3 .docx sections 7.1-7.3 to match IDEA.md
Same text as the IDEA.md update (risk-map ranking, buffer finding, simulated
42% in-shift, decision-clock method and marks, section 10 note). Table of
contents page numbers follow the new layout (7.7-7.10, 9.3, 10, references);
still 16 pages, XSD validation passed.

Co-Authored-By: Claude Opus 5.5 <noreply@anthropic.com>
Claude-Session: https://claude.ai/code/session_0187RMmLFKi7TLGjPXb2WXn3
</commit_message>
<xml_diff>
--- a/D3_Y_tuong_va_giai_phap.docx
+++ b/D3_Y_tuong_va_giai_phap.docx
@@ -1341,7 +1341,7 @@
             <w:fldChar w:fldCharType="begin"/>
             <w:instrText xml:space="preserve"> PAGEREF _Toc30739 \h </w:instrText>
             <w:fldChar w:fldCharType="separate"/>
-            <w:t>12</w:t>
+            <w:t>13</w:t>
             <w:fldChar w:fldCharType="end"/>
             <w:fldChar w:fldCharType="end"/>
           </w:r>
@@ -1369,7 +1369,7 @@
             <w:fldChar w:fldCharType="begin"/>
             <w:instrText xml:space="preserve"> PAGEREF _Toc3996 \h </w:instrText>
             <w:fldChar w:fldCharType="separate"/>
-            <w:t>12</w:t>
+            <w:t>13</w:t>
             <w:fldChar w:fldCharType="end"/>
             <w:fldChar w:fldCharType="end"/>
           </w:r>
@@ -1397,7 +1397,7 @@
             <w:fldChar w:fldCharType="begin"/>
             <w:instrText xml:space="preserve"> PAGEREF _Toc25316 \h </w:instrText>
             <w:fldChar w:fldCharType="separate"/>
-            <w:t>12</w:t>
+            <w:t>13</w:t>
             <w:fldChar w:fldCharType="end"/>
             <w:fldChar w:fldCharType="end"/>
           </w:r>
@@ -1425,7 +1425,7 @@
             <w:fldChar w:fldCharType="begin"/>
             <w:instrText xml:space="preserve"> PAGEREF _Toc23766 \h </w:instrText>
             <w:fldChar w:fldCharType="separate"/>
-            <w:t>12</w:t>
+            <w:t>13</w:t>
             <w:fldChar w:fldCharType="end"/>
             <w:fldChar w:fldCharType="end"/>
           </w:r>
@@ -1565,7 +1565,7 @@
             <w:fldChar w:fldCharType="begin"/>
             <w:instrText xml:space="preserve"> PAGEREF _Toc24666 \h </w:instrText>
             <w:fldChar w:fldCharType="separate"/>
-            <w:t>13</w:t>
+            <w:t>15</w:t>
             <w:fldChar w:fldCharType="end"/>
             <w:fldChar w:fldCharType="end"/>
           </w:r>
@@ -1593,7 +1593,7 @@
             <w:fldChar w:fldCharType="begin"/>
             <w:instrText xml:space="preserve"> PAGEREF _Toc19386 \h </w:instrText>
             <w:fldChar w:fldCharType="separate"/>
-            <w:t>14</w:t>
+            <w:t>15</w:t>
             <w:fldChar w:fldCharType="end"/>
             <w:fldChar w:fldCharType="end"/>
           </w:r>
@@ -1621,7 +1621,7 @@
             <w:fldChar w:fldCharType="begin"/>
             <w:instrText xml:space="preserve"> PAGEREF _Toc6713 \h </w:instrText>
             <w:fldChar w:fldCharType="separate"/>
-            <w:t>15</w:t>
+            <w:t>16</w:t>
             <w:fldChar w:fldCharType="end"/>
             <w:fldChar w:fldCharType="end"/>
           </w:r>
@@ -14833,7 +14833,7 @@
         <w:rPr>
           <w:rFonts w:ascii="Arial" w:hAnsi="Arial" w:eastAsia="Arial" w:cs="Arial"/>
         </w:rPr>
-        <w:t>Mỗi sáng, trước khi vào ca, hệ thống thử lần lượt "nếu máy này hỏng thì sao" cho từng máy và xếp hạng máy nào hỏng thì lan xa nhất (bản đồ rủi ro). Kết quả dùng cho bảo trì phòng ngừa.</w:t>
+        <w:t>Mỗi sáng, trước khi vào ca, hệ thống thử lần lượt "nếu máy này hỏng thì sao" cho từng máy và xếp hạng máy nào hỏng thì lan xa nhất (bản đồ rủi ro). Kết quả dùng cho bảo trì phòng ngừa: ưu tiên = xác suất hỏng trong ca × số sản phẩm mất nếu hỏng (mục 4.6). Mô phỏng với thông số giả định (máy hỏng lúc 10:00, sửa ở mức 80%): M3 (máy cũ, 10%/ca) xếp đầu dù mất ít nhất khi hỏng (112 sp); LR-1 mất nhiều nhất (330 sp) vì Lắp ráp không có máy dự phòng.</w:t>
       </w:r>
     </w:p>
     <w:p>
@@ -14858,7 +14858,32 @@
         <w:rPr>
           <w:rFonts w:ascii="Arial" w:hAnsi="Arial" w:eastAsia="Arial" w:cs="Arial"/>
         </w:rPr>
-        <w:t>. Ví dụ đệm B2: khi M2 hỏng thiếu 28 sp/h, thời gian sửa ở mức 80% là 5 giờ → B2 nên giữ khoảng 140 sp (sức chứa 150), thay vì 60 hiện tại. Đổi lại là thêm khoảng 80 sp bán thành phẩm tồn kho – hệ thống đặt hai con số cạnh nhau để quyết định.</w:t>
+        <w:t>. Ví dụ đệm B2: khi M2 hỏng thiếu 28 sp/h, thời gian sửa ở mức 80% là 5 giờ → B2 nên giữ khoảng 140 sp (sức chứa 150), thay vì 60 hiện tại. Máy tệ nhất trước B2 là M1 (thiếu 30 sp/h) → 150 sp, bằng sức chứa. Đổi lại là thêm 80–90 sp bán thành phẩm tồn kho – hệ thống đặt hai con số cạnh nhau để quyết định. Đệm B1 hiện 200 sp đã đủ cho D1 hỏng 4 giờ.</w:t>
+      </w:r>
+    </w:p>
+    <w:p>
+      <w:pPr>
+        <w:spacing w:after="120" w:line="288" w:lineRule="auto"/>
+      </w:pPr>
+      <w:r>
+        <w:rPr>
+          <w:rFonts w:ascii="Arial" w:hAnsi="Arial" w:eastAsia="Arial" w:cs="Arial"/>
+        </w:rPr>
+        <w:t xml:space="preserve">Mô phỏng cho thấy đệm dày giữ cho cuối chuyền không bị đói hàng nhưng </w:t>
+      </w:r>
+      <w:r>
+        <w:rPr>
+          <w:rFonts w:ascii="Arial" w:hAnsi="Arial" w:eastAsia="Arial" w:cs="Arial"/>
+          <w:b/>
+          <w:bCs/>
+        </w:rPr>
+        <w:t xml:space="preserve">không giảm giờ tăng ca</w:t>
+      </w:r>
+      <w:r>
+        <w:rPr>
+          <w:rFonts w:ascii="Arial" w:hAnsi="Arial" w:eastAsia="Arial" w:cs="Arial"/>
+        </w:rPr>
+        <w:t xml:space="preserve">: B2 = 150 giúp Lắp ráp ra đủ 960 sp lúc 16:00 khi M1 hỏng 5 giờ (thay vì 878), nhưng vẫn cần 66 phút tăng ca vì phần đệm đã dùng phải bù lại (quy ước ở mục 10).</w:t>
       </w:r>
     </w:p>
     <w:p>
@@ -14883,7 +14908,7 @@
         <w:rPr>
           <w:rFonts w:ascii="Arial" w:hAnsi="Arial" w:eastAsia="Arial" w:cs="Arial"/>
         </w:rPr>
-        <w:t xml:space="preserve">Mỗi kế hoạch ca được chạy qua engine với rủi ro hỏng máy lấy từ lịch sử → "xác suất hoàn thành kế hoạch hôm nay: 87%". Nếu thấp, Kế hoạch có thể đăng ký tăng ca dự phòng hoặc tăng đệm </w:t>
+        <w:t xml:space="preserve">Mỗi kế hoạch ca được chạy qua engine nhiều lần với rủi ro lấy từ lịch sử (máy nào hỏng, lúc nào, sửa lệch dự kiến bao lâu, các lần dừng ngắn) → xác suất hoàn thành kế hoạch hôm nay và giờ tăng ca nên đăng ký trước. Nếu thấp, Kế hoạch có thể đăng ký tăng ca dự phòng hoặc tăng đệm </w:t>
       </w:r>
       <w:r>
         <w:rPr>
@@ -14902,6 +14927,31 @@
     </w:p>
     <w:p>
       <w:pPr>
+        <w:spacing w:after="120" w:line="288" w:lineRule="auto"/>
+      </w:pPr>
+      <w:r>
+        <w:rPr>
+          <w:rFonts w:ascii="Arial" w:hAnsi="Arial" w:eastAsia="Arial" w:cs="Arial"/>
+        </w:rPr>
+        <w:t xml:space="preserve">Mô phỏng 300 ca với thông số giả định: đủ kế hoạch trong ca </w:t>
+      </w:r>
+      <w:r>
+        <w:rPr>
+          <w:rFonts w:ascii="Arial" w:hAnsi="Arial" w:eastAsia="Arial" w:cs="Arial"/>
+          <w:b/>
+          <w:bCs/>
+        </w:rPr>
+        <w:t xml:space="preserve">42%</w:t>
+      </w:r>
+      <w:r>
+        <w:rPr>
+          <w:rFonts w:ascii="Arial" w:hAnsi="Arial" w:eastAsia="Arial" w:cs="Arial"/>
+        </w:rPr>
+        <w:t xml:space="preserve">; đăng ký trước 38 phút tăng ca là đủ cho 80% số ca; đủ kế hoạch nếu tăng ca tối đa 4 giờ: 99,7%; đơn D-101 kịp 100%. Con số 42% thấp vì kế hoạch kín 100% công suất chuẩn (960 = 120 sp/h × 8 giờ): sự cố sớm trong ca được tăng tốc bù kịp, nhưng một lần dừng ngắn sát 16:00 thì không còn thời gian bù.</w:t>
+      </w:r>
+    </w:p>
+    <w:p>
+      <w:pPr>
         <w:pStyle w:val="3"/>
         <w:spacing w:before="240" w:after="120"/>
       </w:pPr>
@@ -14936,7 +14986,18 @@
         <w:rPr>
           <w:rFonts w:ascii="Arial" w:hAnsi="Arial" w:eastAsia="Arial" w:cs="Arial"/>
         </w:rPr>
-        <w:t xml:space="preserve"> còn hiệu lực. Ví dụ trường hợp 3: phải quyết đổi thứ tự trước 11:20 (kho L-A cạn); sau đó mỗi phút chậm mất 2 sp. Trường hợp 4: phương án A chỉ còn hiệu lực nếu tăng tốc từ 10:00. Màn hình hiển thị đồng hồ đếm ngược để ba bộ phận biết còn bao lâu để thống nhất.</w:t>
+        <w:t xml:space="preserve"> còn hiệu lực. Hệ thống tính bằng cách chạy lại engine như thể phương án được quyết muộn hơn: trước lúc quyết, dây chuyền chạy như không làm gì. Ví dụ trường hợp 3: phải quyết đổi thứ tự chậm nhất 11:20 (kho L-A cạn); sau đó mỗi phút chậm mất 2 sp và thêm 1 phút tăng ca. Quyết sau 14:20 thì đổi thứ tự còn kém hơn không làm gì (vừa đổi sang Y thì lô L-A về lúc 15:00, lại phải đổi về X, mất thêm 40 phút đổi mã); sau khoảng 14:40 thì mất đơn D-101. Phương án nhà cung cấp tách lô cũng có mốc 11:20. Trường hợp 4: phương án A chỉ còn hiệu lực nếu tăng tốc từ 10:00 – phải quyết ngay; phương án B (chỉ tăng ca) quyết lúc nào trong ca cũng như nhau. Màn hình hiển thị đồng hồ đếm ngược để ba bộ phận biết còn bao lâu để thống nhất.</w:t>
+      </w:r>
+    </w:p>
+    <w:p>
+      <w:pPr>
+        <w:spacing w:after="120" w:line="288" w:lineRule="auto"/>
+      </w:pPr>
+      <w:r>
+        <w:rPr>
+          <w:rFonts w:ascii="Arial" w:hAnsi="Arial" w:eastAsia="Arial" w:cs="Arial"/>
+        </w:rPr>
+        <w:t xml:space="preserve">Mốc trên chưa tính thời gian chuẩn bị (gọi nhà cung cấp, điều người, họp thống nhất); thực tế phải quyết sớm hơn mốc một khoảng bằng thời gian đó.</w:t>
       </w:r>
     </w:p>
     <w:p>
@@ -17534,6 +17595,30 @@
           <w:rFonts w:ascii="Arial" w:hAnsi="Arial" w:eastAsia="Arial" w:cs="Arial"/>
         </w:rPr>
         <w:t xml:space="preserve"> áp dụng cho mọi đệm, kể cả kho thành phẩm: phần đệm bị rút dưới mục tiêu không được tính là sản lượng cứu được. Kho thành phẩm vẫn được dùng khi kiểm tra đơn hàng.</w:t>
+      </w:r>
+    </w:p>
+    <w:p>
+      <w:pPr>
+        <w:pStyle w:val="18"/>
+        <w:numPr>
+          <w:ilvl w:val="0"/>
+          <w:numId w:val="1"/>
+        </w:numPr>
+        <w:spacing w:after="80" w:line="276" w:lineRule="auto"/>
+      </w:pPr>
+      <w:r>
+        <w:rPr>
+          <w:rFonts w:ascii="Arial" w:hAnsi="Arial" w:eastAsia="Arial" w:cs="Arial"/>
+          <w:b/>
+          <w:bCs/>
+        </w:rPr>
+        <w:t xml:space="preserve">Mục 7.1–7.3</w:t>
+      </w:r>
+      <w:r>
+        <w:rPr>
+          <w:rFonts w:ascii="Arial" w:hAnsi="Arial" w:eastAsia="Arial" w:cs="Arial"/>
+        </w:rPr>
+        <w:t xml:space="preserve"> bổ sung số mô phỏng: 7.1 khớp (B2 cần 140 sp khi M2 hỏng); thêm máy tệ nhất M1 → 150 sp và nhận xét đệm dày không giảm giờ tăng ca. 7.2: con số minh họa 87% thay bằng kết quả mô phỏng 42% đủ kế hoạch trong ca (kế hoạch kín 100% công suất chuẩn). 7.3 khớp (trường hợp 3: 11:20, 2 sp/phút; trường hợp 4: 10:00); thêm mốc 14:20 / 14:40 của trường hợp 3.</w:t>
       </w:r>
     </w:p>
     <w:p>

</xml_diff>